<commit_message>
Update briefing to Calibri font + official Skillable logo
Switches all fonts to Calibri (10pt body, 8pt footer) per document
standards. Replaces static/img logo with the official high-res
Default@4x.png from the Sales Enablement logo library.

Co-Authored-By: Claude Sonnet 4.6 <noreply@anthropic.com>
</commit_message>
<xml_diff>
--- a/docs/Skillable-Intelligence-Executive-Briefing.docx
+++ b/docs/Skillable-Intelligence-Executive-Briefing.docx
@@ -8,7 +8,7 @@
       </w:pPr>
       <w:r>
         <w:rPr>
-          <w:rFonts w:ascii="Arial" w:hAnsi="Arial"/>
+          <w:rFonts w:ascii="Calibri" w:hAnsi="Calibri"/>
           <w:b/>
           <w:color w:val="1A4D35"/>
           <w:sz w:val="40"/>
@@ -22,7 +22,7 @@
       </w:pPr>
       <w:r>
         <w:rPr>
-          <w:rFonts w:ascii="Arial" w:hAnsi="Arial"/>
+          <w:rFonts w:ascii="Calibri" w:hAnsi="Calibri"/>
           <w:color w:val="606060"/>
           <w:sz w:val="20"/>
         </w:rPr>
@@ -51,7 +51,7 @@
       </w:pPr>
       <w:r>
         <w:rPr>
-          <w:rFonts w:ascii="Arial" w:hAnsi="Arial"/>
+          <w:rFonts w:ascii="Calibri" w:hAnsi="Calibri"/>
           <w:b/>
           <w:i w:val="0"/>
           <w:color w:val="1A4D35"/>
@@ -66,7 +66,7 @@
       </w:pPr>
       <w:r>
         <w:rPr>
-          <w:rFonts w:ascii="Arial" w:hAnsi="Arial"/>
+          <w:rFonts w:ascii="Calibri" w:hAnsi="Calibri"/>
           <w:b w:val="0"/>
           <w:i w:val="0"/>
           <w:color w:val="1A1A1A"/>
@@ -82,7 +82,7 @@
       </w:pPr>
       <w:r>
         <w:rPr>
-          <w:rFonts w:ascii="Arial" w:hAnsi="Arial"/>
+          <w:rFonts w:ascii="Calibri" w:hAnsi="Calibri"/>
           <w:b w:val="0"/>
           <w:i w:val="0"/>
           <w:color w:val="1A1A1A"/>
@@ -98,7 +98,7 @@
       </w:pPr>
       <w:r>
         <w:rPr>
-          <w:rFonts w:ascii="Arial" w:hAnsi="Arial"/>
+          <w:rFonts w:ascii="Calibri" w:hAnsi="Calibri"/>
           <w:b w:val="0"/>
           <w:i w:val="0"/>
           <w:color w:val="1A1A1A"/>
@@ -114,7 +114,7 @@
       </w:pPr>
       <w:r>
         <w:rPr>
-          <w:rFonts w:ascii="Arial" w:hAnsi="Arial"/>
+          <w:rFonts w:ascii="Calibri" w:hAnsi="Calibri"/>
           <w:b w:val="0"/>
           <w:i w:val="0"/>
           <w:color w:val="1A1A1A"/>
@@ -129,7 +129,7 @@
       </w:pPr>
       <w:r>
         <w:rPr>
-          <w:rFonts w:ascii="Arial" w:hAnsi="Arial"/>
+          <w:rFonts w:ascii="Calibri" w:hAnsi="Calibri"/>
           <w:b/>
           <w:i w:val="0"/>
           <w:color w:val="1A1A1A"/>
@@ -147,7 +147,7 @@
       </w:pPr>
       <w:r>
         <w:rPr>
-          <w:rFonts w:ascii="Arial" w:hAnsi="Arial"/>
+          <w:rFonts w:ascii="Calibri" w:hAnsi="Calibri"/>
           <w:b/>
           <w:i w:val="0"/>
           <w:color w:val="1A4D35"/>
@@ -162,7 +162,7 @@
       </w:pPr>
       <w:r>
         <w:rPr>
-          <w:rFonts w:ascii="Arial" w:hAnsi="Arial"/>
+          <w:rFonts w:ascii="Calibri" w:hAnsi="Calibri"/>
           <w:b w:val="0"/>
           <w:i w:val="0"/>
           <w:color w:val="1A1A1A"/>
@@ -178,7 +178,7 @@
       </w:pPr>
       <w:r>
         <w:rPr>
-          <w:rFonts w:ascii="Arial" w:hAnsi="Arial"/>
+          <w:rFonts w:ascii="Calibri" w:hAnsi="Calibri"/>
           <w:b/>
           <w:i w:val="0"/>
           <w:color w:val="1A1A1A"/>
@@ -188,7 +188,7 @@
       </w:r>
       <w:r>
         <w:rPr>
-          <w:rFonts w:ascii="Arial" w:hAnsi="Arial"/>
+          <w:rFonts w:ascii="Calibri" w:hAnsi="Calibri"/>
           <w:b w:val="0"/>
           <w:i w:val="0"/>
           <w:color w:val="1A1A1A"/>
@@ -204,7 +204,7 @@
       </w:pPr>
       <w:r>
         <w:rPr>
-          <w:rFonts w:ascii="Arial" w:hAnsi="Arial"/>
+          <w:rFonts w:ascii="Calibri" w:hAnsi="Calibri"/>
           <w:b/>
           <w:i w:val="0"/>
           <w:color w:val="1A1A1A"/>
@@ -214,7 +214,7 @@
       </w:r>
       <w:r>
         <w:rPr>
-          <w:rFonts w:ascii="Arial" w:hAnsi="Arial"/>
+          <w:rFonts w:ascii="Calibri" w:hAnsi="Calibri"/>
           <w:b w:val="0"/>
           <w:i w:val="0"/>
           <w:color w:val="1A1A1A"/>
@@ -230,7 +230,7 @@
       </w:pPr>
       <w:r>
         <w:rPr>
-          <w:rFonts w:ascii="Arial" w:hAnsi="Arial"/>
+          <w:rFonts w:ascii="Calibri" w:hAnsi="Calibri"/>
           <w:b/>
           <w:i w:val="0"/>
           <w:color w:val="1A1A1A"/>
@@ -240,7 +240,7 @@
       </w:r>
       <w:r>
         <w:rPr>
-          <w:rFonts w:ascii="Arial" w:hAnsi="Arial"/>
+          <w:rFonts w:ascii="Calibri" w:hAnsi="Calibri"/>
           <w:b w:val="0"/>
           <w:i w:val="0"/>
           <w:color w:val="1A1A1A"/>
@@ -258,7 +258,7 @@
       </w:pPr>
       <w:r>
         <w:rPr>
-          <w:rFonts w:ascii="Arial" w:hAnsi="Arial"/>
+          <w:rFonts w:ascii="Calibri" w:hAnsi="Calibri"/>
           <w:b/>
           <w:i w:val="0"/>
           <w:color w:val="1A4D35"/>
@@ -312,7 +312,7 @@
             </w:pPr>
             <w:r>
               <w:rPr>
-                <w:rFonts w:ascii="Arial" w:hAnsi="Arial"/>
+                <w:rFonts w:ascii="Calibri" w:hAnsi="Calibri"/>
                 <w:b/>
                 <w:color w:val="606060"/>
                 <w:sz w:val="16"/>
@@ -329,7 +329,7 @@
             </w:pPr>
             <w:r>
               <w:rPr>
-                <w:rFonts w:ascii="Arial" w:hAnsi="Arial"/>
+                <w:rFonts w:ascii="Calibri" w:hAnsi="Calibri"/>
                 <w:b/>
                 <w:color w:val="1A1A1A"/>
                 <w:sz w:val="16"/>
@@ -345,7 +345,7 @@
             </w:pPr>
             <w:r>
               <w:rPr>
-                <w:rFonts w:ascii="Arial" w:hAnsi="Arial"/>
+                <w:rFonts w:ascii="Calibri" w:hAnsi="Calibri"/>
                 <w:b/>
                 <w:color w:val="1A4D35"/>
                 <w:sz w:val="16"/>
@@ -362,7 +362,7 @@
             </w:pPr>
             <w:r>
               <w:rPr>
-                <w:rFonts w:ascii="Arial" w:hAnsi="Arial"/>
+                <w:rFonts w:ascii="Calibri" w:hAnsi="Calibri"/>
                 <w:b/>
                 <w:color w:val="FFFFFF"/>
                 <w:sz w:val="16"/>
@@ -378,7 +378,7 @@
             </w:pPr>
             <w:r>
               <w:rPr>
-                <w:rFonts w:ascii="Arial" w:hAnsi="Arial"/>
+                <w:rFonts w:ascii="Calibri" w:hAnsi="Calibri"/>
                 <w:b/>
                 <w:color w:val="1A4D35"/>
                 <w:sz w:val="16"/>
@@ -395,7 +395,7 @@
             </w:pPr>
             <w:r>
               <w:rPr>
-                <w:rFonts w:ascii="Arial" w:hAnsi="Arial"/>
+                <w:rFonts w:ascii="Calibri" w:hAnsi="Calibri"/>
                 <w:b/>
                 <w:color w:val="FFFFFF"/>
                 <w:sz w:val="16"/>
@@ -411,7 +411,7 @@
             </w:pPr>
             <w:r>
               <w:rPr>
-                <w:rFonts w:ascii="Arial" w:hAnsi="Arial"/>
+                <w:rFonts w:ascii="Calibri" w:hAnsi="Calibri"/>
                 <w:b/>
                 <w:color w:val="1A4D35"/>
                 <w:sz w:val="16"/>
@@ -428,7 +428,7 @@
             </w:pPr>
             <w:r>
               <w:rPr>
-                <w:rFonts w:ascii="Arial" w:hAnsi="Arial"/>
+                <w:rFonts w:ascii="Calibri" w:hAnsi="Calibri"/>
                 <w:b/>
                 <w:color w:val="FFFFFF"/>
                 <w:sz w:val="16"/>
@@ -444,7 +444,7 @@
             </w:pPr>
             <w:r>
               <w:rPr>
-                <w:rFonts w:ascii="Arial" w:hAnsi="Arial"/>
+                <w:rFonts w:ascii="Calibri" w:hAnsi="Calibri"/>
                 <w:b/>
                 <w:color w:val="1A4D35"/>
                 <w:sz w:val="16"/>
@@ -461,7 +461,7 @@
             </w:pPr>
             <w:r>
               <w:rPr>
-                <w:rFonts w:ascii="Arial" w:hAnsi="Arial"/>
+                <w:rFonts w:ascii="Calibri" w:hAnsi="Calibri"/>
                 <w:b/>
                 <w:color w:val="1A1A1A"/>
                 <w:sz w:val="16"/>
@@ -486,7 +486,7 @@
             </w:pPr>
             <w:r>
               <w:rPr>
-                <w:rFonts w:ascii="Arial" w:hAnsi="Arial"/>
+                <w:rFonts w:ascii="Calibri" w:hAnsi="Calibri"/>
                 <w:b/>
                 <w:color w:val="606060"/>
                 <w:sz w:val="16"/>
@@ -526,7 +526,7 @@
                 <w:p>
                   <w:r>
                     <w:rPr>
-                      <w:rFonts w:ascii="Arial" w:hAnsi="Arial"/>
+                      <w:rFonts w:ascii="Calibri" w:hAnsi="Calibri"/>
                       <w:b/>
                       <w:color w:val="FFFFFF"/>
                       <w:sz w:val="16"/>
@@ -555,7 +555,7 @@
                 <w:p>
                   <w:r>
                     <w:rPr>
-                      <w:rFonts w:ascii="Arial" w:hAnsi="Arial"/>
+                      <w:rFonts w:ascii="Calibri" w:hAnsi="Calibri"/>
                       <w:b/>
                       <w:color w:val="FFFFFF"/>
                       <w:sz w:val="16"/>
@@ -584,7 +584,7 @@
                 <w:p>
                   <w:r>
                     <w:rPr>
-                      <w:rFonts w:ascii="Arial" w:hAnsi="Arial"/>
+                      <w:rFonts w:ascii="Calibri" w:hAnsi="Calibri"/>
                       <w:b/>
                       <w:color w:val="FFFFFF"/>
                       <w:sz w:val="16"/>
@@ -615,7 +615,7 @@
                 <w:p>
                   <w:r>
                     <w:rPr>
-                      <w:rFonts w:ascii="Arial" w:hAnsi="Arial"/>
+                      <w:rFonts w:ascii="Calibri" w:hAnsi="Calibri"/>
                       <w:b w:val="0"/>
                       <w:color w:val="1A1A1A"/>
                       <w:sz w:val="16"/>
@@ -644,7 +644,7 @@
                 <w:p>
                   <w:r>
                     <w:rPr>
-                      <w:rFonts w:ascii="Arial" w:hAnsi="Arial"/>
+                      <w:rFonts w:ascii="Calibri" w:hAnsi="Calibri"/>
                       <w:b w:val="0"/>
                       <w:color w:val="1A1A1A"/>
                       <w:sz w:val="16"/>
@@ -673,7 +673,7 @@
                 <w:p>
                   <w:r>
                     <w:rPr>
-                      <w:rFonts w:ascii="Arial" w:hAnsi="Arial"/>
+                      <w:rFonts w:ascii="Calibri" w:hAnsi="Calibri"/>
                       <w:b w:val="0"/>
                       <w:color w:val="1A1A1A"/>
                       <w:sz w:val="16"/>
@@ -704,7 +704,7 @@
                 <w:p>
                   <w:r>
                     <w:rPr>
-                      <w:rFonts w:ascii="Arial" w:hAnsi="Arial"/>
+                      <w:rFonts w:ascii="Calibri" w:hAnsi="Calibri"/>
                       <w:b w:val="0"/>
                       <w:color w:val="1A1A1A"/>
                       <w:sz w:val="16"/>
@@ -733,7 +733,7 @@
                 <w:p>
                   <w:r>
                     <w:rPr>
-                      <w:rFonts w:ascii="Arial" w:hAnsi="Arial"/>
+                      <w:rFonts w:ascii="Calibri" w:hAnsi="Calibri"/>
                       <w:b w:val="0"/>
                       <w:color w:val="1A1A1A"/>
                       <w:sz w:val="16"/>
@@ -762,7 +762,7 @@
                 <w:p>
                   <w:r>
                     <w:rPr>
-                      <w:rFonts w:ascii="Arial" w:hAnsi="Arial"/>
+                      <w:rFonts w:ascii="Calibri" w:hAnsi="Calibri"/>
                       <w:b w:val="0"/>
                       <w:color w:val="1A1A1A"/>
                       <w:sz w:val="16"/>
@@ -793,7 +793,7 @@
                 <w:p>
                   <w:r>
                     <w:rPr>
-                      <w:rFonts w:ascii="Arial" w:hAnsi="Arial"/>
+                      <w:rFonts w:ascii="Calibri" w:hAnsi="Calibri"/>
                       <w:b w:val="0"/>
                       <w:color w:val="1A1A1A"/>
                       <w:sz w:val="16"/>
@@ -822,7 +822,7 @@
                 <w:p>
                   <w:r>
                     <w:rPr>
-                      <w:rFonts w:ascii="Arial" w:hAnsi="Arial"/>
+                      <w:rFonts w:ascii="Calibri" w:hAnsi="Calibri"/>
                       <w:b w:val="0"/>
                       <w:color w:val="1A1A1A"/>
                       <w:sz w:val="16"/>
@@ -851,7 +851,7 @@
                 <w:p>
                   <w:r>
                     <w:rPr>
-                      <w:rFonts w:ascii="Arial" w:hAnsi="Arial"/>
+                      <w:rFonts w:ascii="Calibri" w:hAnsi="Calibri"/>
                       <w:b w:val="0"/>
                       <w:color w:val="1A1A1A"/>
                       <w:sz w:val="16"/>
@@ -882,7 +882,7 @@
                 <w:p>
                   <w:r>
                     <w:rPr>
-                      <w:rFonts w:ascii="Arial" w:hAnsi="Arial"/>
+                      <w:rFonts w:ascii="Calibri" w:hAnsi="Calibri"/>
                       <w:b w:val="0"/>
                       <w:color w:val="1A1A1A"/>
                       <w:sz w:val="16"/>
@@ -911,7 +911,7 @@
                 <w:p>
                   <w:r>
                     <w:rPr>
-                      <w:rFonts w:ascii="Arial" w:hAnsi="Arial"/>
+                      <w:rFonts w:ascii="Calibri" w:hAnsi="Calibri"/>
                       <w:b w:val="0"/>
                       <w:color w:val="1A1A1A"/>
                       <w:sz w:val="16"/>
@@ -940,7 +940,7 @@
                 <w:p>
                   <w:r>
                     <w:rPr>
-                      <w:rFonts w:ascii="Arial" w:hAnsi="Arial"/>
+                      <w:rFonts w:ascii="Calibri" w:hAnsi="Calibri"/>
                       <w:b w:val="0"/>
                       <w:color w:val="1A1A1A"/>
                       <w:sz w:val="16"/>
@@ -974,7 +974,7 @@
       </w:pPr>
       <w:r>
         <w:rPr>
-          <w:rFonts w:ascii="Arial" w:hAnsi="Arial"/>
+          <w:rFonts w:ascii="Calibri" w:hAnsi="Calibri"/>
           <w:b/>
           <w:i w:val="0"/>
           <w:color w:val="1A4D35"/>
@@ -990,7 +990,7 @@
       </w:pPr>
       <w:r>
         <w:rPr>
-          <w:rFonts w:ascii="Arial" w:hAnsi="Arial"/>
+          <w:rFonts w:ascii="Calibri" w:hAnsi="Calibri"/>
           <w:b/>
           <w:i w:val="0"/>
           <w:color w:val="1A1A1A"/>
@@ -1000,7 +1000,7 @@
       </w:r>
       <w:r>
         <w:rPr>
-          <w:rFonts w:ascii="Arial" w:hAnsi="Arial"/>
+          <w:rFonts w:ascii="Calibri" w:hAnsi="Calibri"/>
           <w:b w:val="0"/>
           <w:i w:val="0"/>
           <w:color w:val="1A1A1A"/>
@@ -1016,7 +1016,7 @@
       </w:pPr>
       <w:r>
         <w:rPr>
-          <w:rFonts w:ascii="Arial" w:hAnsi="Arial"/>
+          <w:rFonts w:ascii="Calibri" w:hAnsi="Calibri"/>
           <w:b/>
           <w:i w:val="0"/>
           <w:color w:val="1A1A1A"/>
@@ -1026,7 +1026,7 @@
       </w:r>
       <w:r>
         <w:rPr>
-          <w:rFonts w:ascii="Arial" w:hAnsi="Arial"/>
+          <w:rFonts w:ascii="Calibri" w:hAnsi="Calibri"/>
           <w:b w:val="0"/>
           <w:i w:val="0"/>
           <w:color w:val="1A1A1A"/>
@@ -1042,7 +1042,7 @@
       </w:pPr>
       <w:r>
         <w:rPr>
-          <w:rFonts w:ascii="Arial" w:hAnsi="Arial"/>
+          <w:rFonts w:ascii="Calibri" w:hAnsi="Calibri"/>
           <w:b/>
           <w:i w:val="0"/>
           <w:color w:val="1A1A1A"/>
@@ -1052,7 +1052,7 @@
       </w:r>
       <w:r>
         <w:rPr>
-          <w:rFonts w:ascii="Arial" w:hAnsi="Arial"/>
+          <w:rFonts w:ascii="Calibri" w:hAnsi="Calibri"/>
           <w:b w:val="0"/>
           <w:i w:val="0"/>
           <w:color w:val="1A1A1A"/>
@@ -1068,7 +1068,7 @@
       </w:pPr>
       <w:r>
         <w:rPr>
-          <w:rFonts w:ascii="Arial" w:hAnsi="Arial"/>
+          <w:rFonts w:ascii="Calibri" w:hAnsi="Calibri"/>
           <w:b/>
           <w:i w:val="0"/>
           <w:color w:val="1A1A1A"/>
@@ -1078,7 +1078,7 @@
       </w:r>
       <w:r>
         <w:rPr>
-          <w:rFonts w:ascii="Arial" w:hAnsi="Arial"/>
+          <w:rFonts w:ascii="Calibri" w:hAnsi="Calibri"/>
           <w:b w:val="0"/>
           <w:i w:val="0"/>
           <w:color w:val="1A1A1A"/>
@@ -1096,7 +1096,7 @@
       </w:pPr>
       <w:r>
         <w:rPr>
-          <w:rFonts w:ascii="Arial" w:hAnsi="Arial"/>
+          <w:rFonts w:ascii="Calibri" w:hAnsi="Calibri"/>
           <w:b/>
           <w:i w:val="0"/>
           <w:color w:val="1A4D35"/>
@@ -1112,7 +1112,7 @@
       </w:pPr>
       <w:r>
         <w:rPr>
-          <w:rFonts w:ascii="Arial" w:hAnsi="Arial"/>
+          <w:rFonts w:ascii="Calibri" w:hAnsi="Calibri"/>
           <w:b/>
           <w:i w:val="0"/>
           <w:color w:val="1A1A1A"/>
@@ -1122,7 +1122,7 @@
       </w:r>
       <w:r>
         <w:rPr>
-          <w:rFonts w:ascii="Arial" w:hAnsi="Arial"/>
+          <w:rFonts w:ascii="Calibri" w:hAnsi="Calibri"/>
           <w:b w:val="0"/>
           <w:i w:val="0"/>
           <w:color w:val="1A1A1A"/>
@@ -1138,7 +1138,7 @@
       </w:pPr>
       <w:r>
         <w:rPr>
-          <w:rFonts w:ascii="Arial" w:hAnsi="Arial"/>
+          <w:rFonts w:ascii="Calibri" w:hAnsi="Calibri"/>
           <w:b/>
           <w:i w:val="0"/>
           <w:color w:val="1A1A1A"/>
@@ -1148,7 +1148,7 @@
       </w:r>
       <w:r>
         <w:rPr>
-          <w:rFonts w:ascii="Arial" w:hAnsi="Arial"/>
+          <w:rFonts w:ascii="Calibri" w:hAnsi="Calibri"/>
           <w:b w:val="0"/>
           <w:i w:val="0"/>
           <w:color w:val="1A1A1A"/>
@@ -1164,7 +1164,7 @@
       </w:pPr>
       <w:r>
         <w:rPr>
-          <w:rFonts w:ascii="Arial" w:hAnsi="Arial"/>
+          <w:rFonts w:ascii="Calibri" w:hAnsi="Calibri"/>
           <w:b/>
           <w:i w:val="0"/>
           <w:color w:val="1A1A1A"/>
@@ -1174,7 +1174,7 @@
       </w:r>
       <w:r>
         <w:rPr>
-          <w:rFonts w:ascii="Arial" w:hAnsi="Arial"/>
+          <w:rFonts w:ascii="Calibri" w:hAnsi="Calibri"/>
           <w:b w:val="0"/>
           <w:i w:val="0"/>
           <w:color w:val="1A1A1A"/>
@@ -1192,7 +1192,7 @@
       </w:pPr>
       <w:r>
         <w:rPr>
-          <w:rFonts w:ascii="Arial" w:hAnsi="Arial"/>
+          <w:rFonts w:ascii="Calibri" w:hAnsi="Calibri"/>
           <w:b/>
           <w:i w:val="0"/>
           <w:color w:val="1A4D35"/>
@@ -1252,7 +1252,7 @@
             </w:pPr>
             <w:r>
               <w:rPr>
-                <w:rFonts w:ascii="Arial" w:hAnsi="Arial"/>
+                <w:rFonts w:ascii="Calibri" w:hAnsi="Calibri"/>
                 <w:b/>
                 <w:color w:val="1A4D35"/>
                 <w:sz w:val="20"/>
@@ -1267,7 +1267,7 @@
             </w:pPr>
             <w:r>
               <w:rPr>
-                <w:rFonts w:ascii="Arial" w:hAnsi="Arial"/>
+                <w:rFonts w:ascii="Calibri" w:hAnsi="Calibri"/>
                 <w:color w:val="1A1A1A"/>
                 <w:sz w:val="18"/>
               </w:rPr>
@@ -1281,7 +1281,7 @@
             </w:pPr>
             <w:r>
               <w:rPr>
-                <w:rFonts w:ascii="Arial" w:hAnsi="Arial"/>
+                <w:rFonts w:ascii="Calibri" w:hAnsi="Calibri"/>
                 <w:color w:val="1A1A1A"/>
                 <w:sz w:val="18"/>
               </w:rPr>
@@ -1295,7 +1295,7 @@
             </w:pPr>
             <w:r>
               <w:rPr>
-                <w:rFonts w:ascii="Arial" w:hAnsi="Arial"/>
+                <w:rFonts w:ascii="Calibri" w:hAnsi="Calibri"/>
                 <w:color w:val="1A1A1A"/>
                 <w:sz w:val="18"/>
               </w:rPr>
@@ -1309,7 +1309,7 @@
             </w:pPr>
             <w:r>
               <w:rPr>
-                <w:rFonts w:ascii="Arial" w:hAnsi="Arial"/>
+                <w:rFonts w:ascii="Calibri" w:hAnsi="Calibri"/>
                 <w:color w:val="1A1A1A"/>
                 <w:sz w:val="18"/>
               </w:rPr>
@@ -1323,7 +1323,7 @@
             </w:pPr>
             <w:r>
               <w:rPr>
-                <w:rFonts w:ascii="Arial" w:hAnsi="Arial"/>
+                <w:rFonts w:ascii="Calibri" w:hAnsi="Calibri"/>
                 <w:color w:val="1A1A1A"/>
                 <w:sz w:val="18"/>
               </w:rPr>
@@ -1353,7 +1353,7 @@
             </w:pPr>
             <w:r>
               <w:rPr>
-                <w:rFonts w:ascii="Arial" w:hAnsi="Arial"/>
+                <w:rFonts w:ascii="Calibri" w:hAnsi="Calibri"/>
                 <w:b/>
                 <w:color w:val="1A4D35"/>
                 <w:sz w:val="20"/>
@@ -1368,7 +1368,7 @@
             </w:pPr>
             <w:r>
               <w:rPr>
-                <w:rFonts w:ascii="Arial" w:hAnsi="Arial"/>
+                <w:rFonts w:ascii="Calibri" w:hAnsi="Calibri"/>
                 <w:color w:val="1A1A1A"/>
                 <w:sz w:val="18"/>
               </w:rPr>
@@ -1382,7 +1382,7 @@
             </w:pPr>
             <w:r>
               <w:rPr>
-                <w:rFonts w:ascii="Arial" w:hAnsi="Arial"/>
+                <w:rFonts w:ascii="Calibri" w:hAnsi="Calibri"/>
                 <w:color w:val="1A1A1A"/>
                 <w:sz w:val="18"/>
               </w:rPr>
@@ -1396,7 +1396,7 @@
             </w:pPr>
             <w:r>
               <w:rPr>
-                <w:rFonts w:ascii="Arial" w:hAnsi="Arial"/>
+                <w:rFonts w:ascii="Calibri" w:hAnsi="Calibri"/>
                 <w:color w:val="1A1A1A"/>
                 <w:sz w:val="18"/>
               </w:rPr>
@@ -1410,7 +1410,7 @@
             </w:pPr>
             <w:r>
               <w:rPr>
-                <w:rFonts w:ascii="Arial" w:hAnsi="Arial"/>
+                <w:rFonts w:ascii="Calibri" w:hAnsi="Calibri"/>
                 <w:color w:val="1A1A1A"/>
                 <w:sz w:val="18"/>
               </w:rPr>
@@ -1424,7 +1424,7 @@
             </w:pPr>
             <w:r>
               <w:rPr>
-                <w:rFonts w:ascii="Arial" w:hAnsi="Arial"/>
+                <w:rFonts w:ascii="Calibri" w:hAnsi="Calibri"/>
                 <w:color w:val="1A1A1A"/>
                 <w:sz w:val="18"/>
               </w:rPr>
@@ -1455,12 +1455,21 @@
     </w:pPr>
     <w:r>
       <w:rPr>
+        <w:rFonts w:ascii="Calibri" w:hAnsi="Calibri"/>
+        <w:sz w:val="16"/>
+        <w:szCs w:val="16"/>
+        <w:color w:val="888888"/>
+      </w:rPr>
+      <w:t xml:space="preserve">Page </w:t>
+    </w:r>
+    <w:r>
+      <w:rPr>
         <w:rFonts w:ascii="Arial" w:hAnsi="Arial"/>
         <w:sz w:val="18"/>
         <w:szCs w:val="18"/>
         <w:color w:val="888888"/>
       </w:rPr>
-      <w:t xml:space="preserve">Page </w:t>
+      <w:fldChar w:fldCharType="begin"/>
     </w:r>
     <w:r>
       <w:rPr>
@@ -1469,7 +1478,7 @@
         <w:szCs w:val="18"/>
         <w:color w:val="888888"/>
       </w:rPr>
-      <w:fldChar w:fldCharType="begin"/>
+      <w:instrText xml:space="preserve"> PAGE </w:instrText>
     </w:r>
     <w:r>
       <w:rPr>
@@ -1478,22 +1487,13 @@
         <w:szCs w:val="18"/>
         <w:color w:val="888888"/>
       </w:rPr>
-      <w:instrText xml:space="preserve"> PAGE </w:instrText>
-    </w:r>
-    <w:r>
-      <w:rPr>
-        <w:rFonts w:ascii="Arial" w:hAnsi="Arial"/>
-        <w:sz w:val="18"/>
-        <w:szCs w:val="18"/>
-        <w:color w:val="888888"/>
-      </w:rPr>
       <w:fldChar w:fldCharType="end"/>
     </w:r>
     <w:r>
       <w:rPr>
-        <w:rFonts w:ascii="Arial" w:hAnsi="Arial"/>
-        <w:sz w:val="18"/>
-        <w:szCs w:val="18"/>
+        <w:rFonts w:ascii="Calibri" w:hAnsi="Calibri"/>
+        <w:sz w:val="16"/>
+        <w:szCs w:val="16"/>
         <w:color w:val="888888"/>
       </w:rPr>
       <w:t xml:space="preserve"> of </w:t>
@@ -1539,7 +1539,7 @@
     <w:r>
       <w:drawing>
         <wp:inline xmlns:a="http://schemas.openxmlformats.org/drawingml/2006/main" xmlns:pic="http://schemas.openxmlformats.org/drawingml/2006/picture">
-          <wp:extent cx="1005840" cy="528066"/>
+          <wp:extent cx="1005840" cy="334541"/>
           <wp:docPr id="1" name="Picture 1"/>
           <wp:cNvGraphicFramePr>
             <a:graphicFrameLocks noChangeAspect="1"/>
@@ -1560,7 +1560,7 @@
                 <pic:spPr>
                   <a:xfrm>
                     <a:off x="0" y="0"/>
-                    <a:ext cx="1005840" cy="528066"/>
+                    <a:ext cx="1005840" cy="334541"/>
                   </a:xfrm>
                   <a:prstGeom prst="rect"/>
                 </pic:spPr>
@@ -1951,7 +1951,7 @@
     <w:qFormat/>
     <w:rsid w:val="00FC693F"/>
     <w:rPr>
-      <w:rFonts w:ascii="Arial" w:hAnsi="Arial"/>
+      <w:rFonts w:ascii="Calibri" w:hAnsi="Calibri"/>
       <w:sz w:val="20"/>
     </w:rPr>
   </w:style>

</xml_diff>

<commit_message>
Add lab maturity detail page; finalize briefing RevOps section
Adds /inspector/results/<id>/lab-maturity deep-link page (HubSpot target)
showing full Lab Maturity Signals card with all dimensions and evidence.
Renames .partnership-card CSS class to .lab-maturity-card for consistency.
Updates briefing RevOps column to 5 recommendations + 2 open questions
per agreed final content.

Co-Authored-By: Claude Sonnet 4.6 <noreply@anthropic.com>
</commit_message>
<xml_diff>
--- a/docs/Skillable-Intelligence-Executive-Briefing.docx
+++ b/docs/Skillable-Intelligence-Executive-Briefing.docx
@@ -1381,7 +1381,7 @@
                 <w:color w:val="1A1A1A"/>
                 <w:sz w:val="18"/>
               </w:rPr>
-              <w:t xml:space="preserve"> Add a “Products” card to the HubSpot Company record listing each scored product as a link to its Inspector detail page, labeled Highly Labable / Likely Labable / Not Labable.</w:t>
+              <w:t xml:space="preserve"> Add a “Products” card to the HubSpot Company record — each product listed as a link to its Inspector score page, labeled Highly Labable / Likely Labable / Not Labable.</w:t>
             </w:r>
           </w:p>
           <w:p>
@@ -1404,7 +1404,76 @@
                 <w:color w:val="1A1A1A"/>
                 <w:sz w:val="18"/>
               </w:rPr>
-              <w:t xml:space="preserve"> Add a “Lab Maturity Signals” link on the Company record pointing to the Inspector Lab Maturity Signals card for that company.</w:t>
+              <w:t xml:space="preserve"> Add a “Lab Maturity Signals →” link on the Company record pointing to the full lab maturity breakdown page in Inspector.</w:t>
+            </w:r>
+          </w:p>
+          <w:p>
+            <w:pPr>
+              <w:pStyle w:val="ListBullet"/>
+              <w:spacing w:before="0" w:after="50"/>
+            </w:pPr>
+            <w:r>
+              <w:rPr>
+                <w:rFonts w:ascii="Calibri" w:hAnsi="Calibri"/>
+                <w:b/>
+                <w:color w:val="1A1A1A"/>
+                <w:sz w:val="18"/>
+              </w:rPr>
+              <w:t>Recommended:</w:t>
+            </w:r>
+            <w:r>
+              <w:rPr>
+                <w:rFonts w:ascii="Calibri" w:hAnsi="Calibri"/>
+                <w:color w:val="1A1A1A"/>
+                <w:sz w:val="18"/>
+              </w:rPr>
+              <w:t xml:space="preserve"> Prospector results should update existing HubSpot Contacts or add new ones — not a separate object.</w:t>
+            </w:r>
+          </w:p>
+          <w:p>
+            <w:pPr>
+              <w:pStyle w:val="ListBullet"/>
+              <w:spacing w:before="0" w:after="50"/>
+            </w:pPr>
+            <w:r>
+              <w:rPr>
+                <w:rFonts w:ascii="Calibri" w:hAnsi="Calibri"/>
+                <w:b/>
+                <w:color w:val="1A1A1A"/>
+                <w:sz w:val="18"/>
+              </w:rPr>
+              <w:t>Recommended:</w:t>
+            </w:r>
+            <w:r>
+              <w:rPr>
+                <w:rFonts w:ascii="Calibri" w:hAnsi="Calibri"/>
+                <w:color w:val="1A1A1A"/>
+                <w:sz w:val="18"/>
+              </w:rPr>
+              <w:t xml:space="preserve"> RevOps owns the HubSpot integration build.</w:t>
+            </w:r>
+          </w:p>
+          <w:p>
+            <w:pPr>
+              <w:pStyle w:val="ListBullet"/>
+              <w:spacing w:before="0" w:after="50"/>
+            </w:pPr>
+            <w:r>
+              <w:rPr>
+                <w:rFonts w:ascii="Calibri" w:hAnsi="Calibri"/>
+                <w:b/>
+                <w:color w:val="1A1A1A"/>
+                <w:sz w:val="18"/>
+              </w:rPr>
+              <w:t>Recommended:</w:t>
+            </w:r>
+            <w:r>
+              <w:rPr>
+                <w:rFonts w:ascii="Calibri" w:hAnsi="Calibri"/>
+                <w:color w:val="1A1A1A"/>
+                <w:sz w:val="18"/>
+              </w:rPr>
+              <w:t xml:space="preserve"> Identify the existing HubSpot source attribution field (“Lead Source” or equivalent) and confirm the stamp value (e.g., “Skillable Intelligence”) — enables pipeline influence reporting.</w:t>
             </w:r>
           </w:p>
           <w:p>
@@ -1418,7 +1487,7 @@
                 <w:color w:val="1A1A1A"/>
                 <w:sz w:val="18"/>
               </w:rPr>
-              <w:t>Standard ZoomInfo export format? Which filters before feeding Prospector?</w:t>
+              <w:t>Standard ZoomInfo export format? Which filters to apply before feeding Prospector?</w:t>
             </w:r>
           </w:p>
           <w:p>
@@ -1432,35 +1501,7 @@
                 <w:color w:val="1A1A1A"/>
                 <w:sz w:val="18"/>
               </w:rPr>
-              <w:t>Should Prospector results create new HubSpot Contacts, update existing, or feed a separate object?</w:t>
-            </w:r>
-          </w:p>
-          <w:p>
-            <w:pPr>
-              <w:pStyle w:val="ListBullet"/>
-              <w:spacing w:before="0" w:after="50"/>
-            </w:pPr>
-            <w:r>
-              <w:rPr>
-                <w:rFonts w:ascii="Calibri" w:hAnsi="Calibri"/>
-                <w:color w:val="1A1A1A"/>
-                <w:sz w:val="18"/>
-              </w:rPr>
-              <w:t>Who owns the HubSpot integration build — RevOps, engineering, or third party?</w:t>
-            </w:r>
-          </w:p>
-          <w:p>
-            <w:pPr>
-              <w:pStyle w:val="ListBullet"/>
-              <w:spacing w:before="0" w:after="50"/>
-            </w:pPr>
-            <w:r>
-              <w:rPr>
-                <w:rFonts w:ascii="Calibri" w:hAnsi="Calibri"/>
-                <w:color w:val="1A1A1A"/>
-                <w:sz w:val="18"/>
-              </w:rPr>
-              <w:t>How do we track whether an Inspector analysis influenced a pipeline opportunity?</w:t>
+              <w:t>What other tools are in the RevOps stack (Salesforce, Outreach, Apollo, Sales Navigator, etc.) that should be considered for integration or data handoff?</w:t>
             </w:r>
           </w:p>
         </w:tc>

</xml_diff>

<commit_message>
Expand Security section: Serper creds, caching, repo tree, audit logging
- Credential Handling: explicitly calls out both Anthropic and Serper keys
  with subscription context and production Key Vault plan
- Current State: adds caching strategy (skips API calls on cache hit) and
  notes flat JSON storage with planned database migration
- Adds annotated directory tree (Consolas, light gray bg) showing repo
  structure and personal-account flag for SecOps
- Risks: adds missing audit trail as an explicit gap
- SecOps open questions: reframed GitHub/Azure questions to VP level,
  added audit logging question with specific scope

Co-Authored-By: Claude Sonnet 4.6 <noreply@anthropic.com>
</commit_message>
<xml_diff>
--- a/docs/Skillable-Intelligence-Executive-Briefing.docx
+++ b/docs/Skillable-Intelligence-Executive-Briefing.docx
@@ -1006,7 +1006,7 @@
           <w:color w:val="1A1A1A"/>
           <w:sz w:val="20"/>
         </w:rPr>
-        <w:t xml:space="preserve"> API keys (Anthropic, Serper) live server-side in a .env file — never in browser storage or source code. All client-side API calls were eliminated in the most recent build cycle.</w:t>
+        <w:t xml:space="preserve"> Two API keys in a server-side .env file — never in browser storage or source code. (1) Anthropic Claude API — AI research and scoring engine; all three tools depend on it. (2) Serper.dev — Google Search API used for web research on every company analysis; requires a paid subscription. Both keys move to Azure Key Vault in production.</w:t>
       </w:r>
     </w:p>
     <w:p>
@@ -1048,7 +1048,7 @@
           <w:color w:val="1A1A1A"/>
           <w:sz w:val="20"/>
         </w:rPr>
-        <w:t>Current State:</w:t>
+        <w:t>Current State — Storage &amp; Caching:</w:t>
       </w:r>
       <w:r>
         <w:rPr>
@@ -1058,7 +1058,7 @@
           <w:color w:val="1A1A1A"/>
           <w:sz w:val="20"/>
         </w:rPr>
-        <w:t xml:space="preserve"> No user authentication today — runs locally on a developer machine. Must be resolved before any shared deployment. No database; results stored as flat JSON on local filesystem.</w:t>
+        <w:t xml:space="preserve"> No user authentication — currently runs on a developer’s local machine. No database; analysis results stored as flat JSON files on the local filesystem. Results are aggressively cached: re-analyzing a company already in the cache skips all Anthropic and Serper API calls, reducing cost and latency significantly.</w:t>
       </w:r>
     </w:p>
     <w:p>
@@ -1084,7 +1084,190 @@
           <w:color w:val="1A1A1A"/>
           <w:sz w:val="20"/>
         </w:rPr>
-        <w:t xml:space="preserve"> API key exposure (low risk today, needs Azure Key Vault in production). Unauthenticated access (needs Entra ID/SSO before deployment). Data residency: AI calls to Anthropic (US), web search through Serper/Google, no internal data egress. GitHub repo currently on personal account — needs to move to corporate Skillable GitHub with proper access controls.</w:t>
+        <w:t xml:space="preserve"> API key exposure (low risk today, needs Azure Key Vault in production). Unauthenticated access (needs Entra ID/SSO before any shared deployment). Data residency: AI calls to Anthropic (US), web search via Serper/Google, no internal data egress. Repo currently on personal GitHub account — needs to move to corporate Skillable org. No audit trail of who ran which analyses.</w:t>
+      </w:r>
+    </w:p>
+    <w:p>
+      <w:pPr>
+        <w:spacing w:before="0" w:after="0"/>
+      </w:pPr>
+      <w:r>
+        <w:rPr>
+          <w:sz w:val="12"/>
+        </w:rPr>
+      </w:r>
+    </w:p>
+    <w:p>
+      <w:pPr>
+        <w:spacing w:before="40" w:after="40"/>
+      </w:pPr>
+      <w:r>
+        <w:rPr>
+          <w:rFonts w:ascii="Calibri" w:hAnsi="Calibri"/>
+          <w:color w:val="606060"/>
+          <w:sz w:val="16"/>
+        </w:rPr>
+        <w:t>Current repo structure (github.com/fgartland4/skillable-intelligence):</w:t>
+      </w:r>
+    </w:p>
+    <w:p>
+      <w:pPr>
+        <w:spacing w:before="0" w:after="0"/>
+        <w:shd w:val="clear" w:color="auto" w:fill="F2F5F3"/>
+        <w:ind w:left="200" w:right="200"/>
+      </w:pPr>
+      <w:r>
+        <w:rPr>
+          <w:rFonts w:ascii="Consolas" w:hAnsi="Consolas"/>
+          <w:color w:val="1A1A1A"/>
+          <w:sz w:val="16"/>
+        </w:rPr>
+        <w:t>skillable-intelligence/          ← Personal GitHub (fgartland4) — needs to move to Skillable org</w:t>
+      </w:r>
+    </w:p>
+    <w:p>
+      <w:pPr>
+        <w:spacing w:before="0" w:after="0"/>
+        <w:shd w:val="clear" w:color="auto" w:fill="F2F5F3"/>
+        <w:ind w:left="200" w:right="200"/>
+      </w:pPr>
+      <w:r>
+        <w:rPr>
+          <w:rFonts w:ascii="Consolas" w:hAnsi="Consolas"/>
+          <w:color w:val="1A1A1A"/>
+          <w:sz w:val="16"/>
+        </w:rPr>
+        <w:t>├── backend/                     Flask app: routes, scoring engine, AI calls, storage</w:t>
+      </w:r>
+    </w:p>
+    <w:p>
+      <w:pPr>
+        <w:spacing w:before="0" w:after="0"/>
+        <w:shd w:val="clear" w:color="auto" w:fill="F2F5F3"/>
+        <w:ind w:left="200" w:right="200"/>
+      </w:pPr>
+      <w:r>
+        <w:rPr>
+          <w:rFonts w:ascii="Consolas" w:hAnsi="Consolas"/>
+          <w:color w:val="1A1A1A"/>
+          <w:sz w:val="16"/>
+        </w:rPr>
+        <w:t>├── tools/</w:t>
+      </w:r>
+    </w:p>
+    <w:p>
+      <w:pPr>
+        <w:spacing w:before="0" w:after="0"/>
+        <w:shd w:val="clear" w:color="auto" w:fill="F2F5F3"/>
+        <w:ind w:left="200" w:right="200"/>
+      </w:pPr>
+      <w:r>
+        <w:rPr>
+          <w:rFonts w:ascii="Consolas" w:hAnsi="Consolas"/>
+          <w:color w:val="1A1A1A"/>
+          <w:sz w:val="16"/>
+        </w:rPr>
+        <w:t>│   ├── inspector/templates/     Inspector UI</w:t>
+      </w:r>
+    </w:p>
+    <w:p>
+      <w:pPr>
+        <w:spacing w:before="0" w:after="0"/>
+        <w:shd w:val="clear" w:color="auto" w:fill="F2F5F3"/>
+        <w:ind w:left="200" w:right="200"/>
+      </w:pPr>
+      <w:r>
+        <w:rPr>
+          <w:rFonts w:ascii="Consolas" w:hAnsi="Consolas"/>
+          <w:color w:val="1A1A1A"/>
+          <w:sz w:val="16"/>
+        </w:rPr>
+        <w:t>│   ├── prospector/templates/    Prospector UI</w:t>
+      </w:r>
+    </w:p>
+    <w:p>
+      <w:pPr>
+        <w:spacing w:before="0" w:after="0"/>
+        <w:shd w:val="clear" w:color="auto" w:fill="F2F5F3"/>
+        <w:ind w:left="200" w:right="200"/>
+      </w:pPr>
+      <w:r>
+        <w:rPr>
+          <w:rFonts w:ascii="Consolas" w:hAnsi="Consolas"/>
+          <w:color w:val="1A1A1A"/>
+          <w:sz w:val="16"/>
+        </w:rPr>
+        <w:t>│   └── designer/                Designer UI + client JS</w:t>
+      </w:r>
+    </w:p>
+    <w:p>
+      <w:pPr>
+        <w:spacing w:before="0" w:after="0"/>
+        <w:shd w:val="clear" w:color="auto" w:fill="F2F5F3"/>
+        <w:ind w:left="200" w:right="200"/>
+      </w:pPr>
+      <w:r>
+        <w:rPr>
+          <w:rFonts w:ascii="Consolas" w:hAnsi="Consolas"/>
+          <w:color w:val="1A1A1A"/>
+          <w:sz w:val="16"/>
+        </w:rPr>
+        <w:t>├── static/                      Shared CSS, JS, images</w:t>
+      </w:r>
+    </w:p>
+    <w:p>
+      <w:pPr>
+        <w:spacing w:before="0" w:after="0"/>
+        <w:shd w:val="clear" w:color="auto" w:fill="F2F5F3"/>
+        <w:ind w:left="200" w:right="200"/>
+      </w:pPr>
+      <w:r>
+        <w:rPr>
+          <w:rFonts w:ascii="Consolas" w:hAnsi="Consolas"/>
+          <w:color w:val="1A1A1A"/>
+          <w:sz w:val="16"/>
+        </w:rPr>
+        <w:t>├── docs/                        Executive briefing + generator</w:t>
+      </w:r>
+    </w:p>
+    <w:p>
+      <w:pPr>
+        <w:spacing w:before="0" w:after="0"/>
+        <w:shd w:val="clear" w:color="auto" w:fill="F2F5F3"/>
+        <w:ind w:left="200" w:right="200"/>
+      </w:pPr>
+      <w:r>
+        <w:rPr>
+          <w:rFonts w:ascii="Consolas" w:hAnsi="Consolas"/>
+          <w:color w:val="1A1A1A"/>
+          <w:sz w:val="16"/>
+        </w:rPr>
+        <w:t>├── .gitignore</w:t>
+      </w:r>
+    </w:p>
+    <w:p>
+      <w:pPr>
+        <w:spacing w:before="0" w:after="0"/>
+        <w:shd w:val="clear" w:color="auto" w:fill="F2F5F3"/>
+        <w:ind w:left="200" w:right="200"/>
+      </w:pPr>
+      <w:r>
+        <w:rPr>
+          <w:rFonts w:ascii="Consolas" w:hAnsi="Consolas"/>
+          <w:color w:val="1A1A1A"/>
+          <w:sz w:val="16"/>
+        </w:rPr>
+        <w:t>└── render.yaml                  Deployment config</w:t>
+      </w:r>
+    </w:p>
+    <w:p>
+      <w:pPr>
+        <w:spacing w:before="0" w:after="0"/>
+      </w:pPr>
+      <w:r>
+        <w:rPr>
+          <w:sz w:val="12"/>
+        </w:rPr>
       </w:r>
     </w:p>
     <w:p>
@@ -1271,7 +1454,7 @@
                 <w:color w:val="1A1A1A"/>
                 <w:sz w:val="18"/>
               </w:rPr>
-              <w:t>Process for moving repo to corporate GitHub? Who approves access?</w:t>
+              <w:t>What’s the process for moving a repo to the corporate GitHub org? Who approves access and sets permissions?</w:t>
             </w:r>
           </w:p>
           <w:p>
@@ -1285,7 +1468,7 @@
                 <w:color w:val="1A1A1A"/>
                 <w:sz w:val="18"/>
               </w:rPr>
-              <w:t>Which Azure subscription and resource group for App Service?</w:t>
+              <w:t>Which Azure subscription and resource group should this live in, and what’s the approval process for deploying a new internal tool?</w:t>
             </w:r>
           </w:p>
           <w:p>
@@ -1313,7 +1496,7 @@
                 <w:color w:val="1A1A1A"/>
                 <w:sz w:val="18"/>
               </w:rPr>
-              <w:t>Data classification for JSON analysis files (public info + LinkedIn URLs)?</w:t>
+              <w:t>Data classification for JSON analysis files (public company info + LinkedIn URLs)?</w:t>
             </w:r>
           </w:p>
           <w:p>
@@ -1327,7 +1510,21 @@
                 <w:color w:val="1A1A1A"/>
                 <w:sz w:val="18"/>
               </w:rPr>
-              <w:t>DLP or egress controls affecting calls to Anthropic or Serper APIs?</w:t>
+              <w:t>DLP or egress controls that could affect outbound calls to Anthropic (US) or Serper APIs?</w:t>
+            </w:r>
+          </w:p>
+          <w:p>
+            <w:pPr>
+              <w:pStyle w:val="ListBullet"/>
+              <w:spacing w:before="0" w:after="50"/>
+            </w:pPr>
+            <w:r>
+              <w:rPr>
+                <w:rFonts w:ascii="Calibri" w:hAnsi="Calibri"/>
+                <w:color w:val="1A1A1A"/>
+                <w:sz w:val="18"/>
+              </w:rPr>
+              <w:t>Do you require audit logging for internal tools that make external API calls? If so, what’s the standard — we’d log user, company analyzed, timestamp, and APIs called.</w:t>
             </w:r>
           </w:p>
         </w:tc>

</xml_diff>

<commit_message>
Standardize bullet order and add bold lead-ins to Section 1
Both sections now follow: Prospector → Inspector → Designer.
Section 1 problems get bold lead-ins matching the platform vocabulary:
Targeting & Lead Qualification / Accelerate Discovery / Facilitate Lab
Design & Decrease TTV — mirroring the bold prefix style of Section 2.

Co-Authored-By: Claude Sonnet 4.6 <noreply@anthropic.com>
</commit_message>
<xml_diff>
--- a/docs/Skillable-Intelligence-Executive-Briefing.docx
+++ b/docs/Skillable-Intelligence-Executive-Briefing.docx
@@ -83,12 +83,22 @@
       <w:r>
         <w:rPr>
           <w:rFonts w:ascii="Calibri" w:hAnsi="Calibri"/>
+          <w:b/>
+          <w:i w:val="0"/>
+          <w:color w:val="1A1A1A"/>
+          <w:sz w:val="20"/>
+        </w:rPr>
+        <w:t>Targeting &amp; Lead Qualification:</w:t>
+      </w:r>
+      <w:r>
+        <w:rPr>
+          <w:rFonts w:ascii="Calibri" w:hAnsi="Calibri"/>
           <w:b w:val="0"/>
           <w:i w:val="0"/>
           <w:color w:val="1A1A1A"/>
           <w:sz w:val="20"/>
         </w:rPr>
-        <w:t>No fast way to qualify a company for a lab conversation. SEs and AMs spend hours researching whether a prospect’s products are technically buildable as Skillable labs — time that compounds across every territory.</w:t>
+        <w:t xml:space="preserve"> No scalable way to build target lists. Identifying companies with the right training ecosystems, technical products, and partner programs for a Skillable conversation currently requires manual research at every stage.</w:t>
       </w:r>
     </w:p>
     <w:p>
@@ -99,12 +109,22 @@
       <w:r>
         <w:rPr>
           <w:rFonts w:ascii="Calibri" w:hAnsi="Calibri"/>
+          <w:b/>
+          <w:i w:val="0"/>
+          <w:color w:val="1A1A1A"/>
+          <w:sz w:val="20"/>
+        </w:rPr>
+        <w:t>Accelerate Discovery:</w:t>
+      </w:r>
+      <w:r>
+        <w:rPr>
+          <w:rFonts w:ascii="Calibri" w:hAnsi="Calibri"/>
           <w:b w:val="0"/>
           <w:i w:val="0"/>
           <w:color w:val="1A1A1A"/>
           <w:sz w:val="20"/>
         </w:rPr>
-        <w:t>No scalable way to build target lists. Identifying companies with the right training ecosystems, partner programs, and technical products for a Skillable partnership currently requires manual research at every stage.</w:t>
+        <w:t xml:space="preserve"> No fast way to qualify a company once identified. SEs and AMs spend hours researching whether a prospect’s products are technically buildable as Skillable labs — time that compounds across every territory.</w:t>
       </w:r>
     </w:p>
     <w:p>
@@ -115,12 +135,22 @@
       <w:r>
         <w:rPr>
           <w:rFonts w:ascii="Calibri" w:hAnsi="Calibri"/>
+          <w:b/>
+          <w:i w:val="0"/>
+          <w:color w:val="1A1A1A"/>
+          <w:sz w:val="20"/>
+        </w:rPr>
+        <w:t>Facilitate Lab Design &amp; Decrease TTV:</w:t>
+      </w:r>
+      <w:r>
+        <w:rPr>
+          <w:rFonts w:ascii="Calibri" w:hAnsi="Calibri"/>
           <w:b w:val="0"/>
           <w:i w:val="0"/>
           <w:color w:val="1A1A1A"/>
           <w:sz w:val="20"/>
         </w:rPr>
-        <w:t>No starting point for lab program design. When an SE wants to propose a lab program to a prospect, they start from a blank page — no structure, no connection to the research already done on the company.</w:t>
+        <w:t xml:space="preserve"> No starting point for lab program design. When an SE wants to propose a lab program, they start from a blank page — no structure, no connection to the research already done on the company.</w:t>
       </w:r>
     </w:p>
     <w:p>
@@ -184,7 +214,7 @@
           <w:color w:val="1A1A1A"/>
           <w:sz w:val="20"/>
         </w:rPr>
-        <w:t>Inspector — Single-Company Deep Analysis.</w:t>
+        <w:t>Prospector — Batch Territory Scoring.</w:t>
       </w:r>
       <w:r>
         <w:rPr>
@@ -194,7 +224,7 @@
           <w:color w:val="1A1A1A"/>
           <w:sz w:val="20"/>
         </w:rPr>
-        <w:t xml:space="preserve"> Scores a company’s products for labability (0–100) across four dimensions; produces a lab maturity score, opportunity composite, recommended Skillable path (VM / Cloud Slice / Simulation), estimated annual ACV, and named contacts for training/enablement outreach. Used by SEs and AMs for pre-call research.</w:t>
+        <w:t xml:space="preserve"> Runs a lightweight Inspector analysis on a full ZoomInfo export simultaneously — returns a ranked, scored table with labability/lab maturity/composite scores, a path label (Labable / Simulations / Do Not Pursue / Academic / Not a Fit), and top two contacts per company with LinkedIn and Excel export. Used by RevOps and field sales for account-based targeting.</w:t>
       </w:r>
     </w:p>
     <w:p>
@@ -210,7 +240,7 @@
           <w:color w:val="1A1A1A"/>
           <w:sz w:val="20"/>
         </w:rPr>
-        <w:t>Prospector — Batch Territory Scoring.</w:t>
+        <w:t>Inspector — Single-Company Deep Analysis.</w:t>
       </w:r>
       <w:r>
         <w:rPr>
@@ -220,7 +250,7 @@
           <w:color w:val="1A1A1A"/>
           <w:sz w:val="20"/>
         </w:rPr>
-        <w:t xml:space="preserve"> Runs a lightweight Inspector analysis on a full ZoomInfo export simultaneously — returns a ranked, scored table with labability/lab maturity/composite scores, a path label (Labable / Simulations / Do Not Pursue / Academic / Not a Fit), and top two contacts per company with LinkedIn and Excel export. Used by RevOps and field sales for account-based targeting.</w:t>
+        <w:t xml:space="preserve"> Scores a company’s products for labability (0–100) across four dimensions; produces a lab maturity score, opportunity composite, recommended Skillable path (VM / Cloud Slice / Simulation), estimated annual ACV, and named contacts for training/enablement outreach. Used by SEs and AMs for pre-call research.</w:t>
       </w:r>
     </w:p>
     <w:p>

</xml_diff>

<commit_message>
Strengthen Section 1 lead-ins with Labability language
Replaces generic category labels with action-oriented statements that
embed Labability as the central concept:
- Leverage Labability for Targeting & Lead Qualification
- Accelerate Discovery with AI-Powered Labability Scoring
- Leverage AI-Generated Intelligence to Design Programs and Lab Templates

Co-Authored-By: Claude Sonnet 4.6 <noreply@anthropic.com>
</commit_message>
<xml_diff>
--- a/docs/Skillable-Intelligence-Executive-Briefing.docx
+++ b/docs/Skillable-Intelligence-Executive-Briefing.docx
@@ -62,6 +62,30 @@
     </w:p>
     <w:p>
       <w:pPr>
+        <w:jc w:val="left"/>
+        <w:spacing w:before="0" w:after="80"/>
+      </w:pPr>
+      <w:r>
+        <w:rPr>
+          <w:rFonts w:ascii="Calibri" w:hAnsi="Calibri"/>
+          <w:b/>
+          <w:color w:val="1A4D35"/>
+          <w:sz w:val="20"/>
+        </w:rPr>
+        <w:t>Labability</w:t>
+      </w:r>
+      <w:r>
+        <w:rPr>
+          <w:rFonts w:ascii="Calibri" w:hAnsi="Calibri"/>
+          <w:i/>
+          <w:color w:val="606060"/>
+          <w:sz w:val="20"/>
+        </w:rPr>
+        <w:t xml:space="preserve"> — whether a company’s products are technically and commercially suited for hands-on Skillable lab delivery — is the core question this platform is built to answer.</w:t>
+      </w:r>
+    </w:p>
+    <w:p>
+      <w:pPr>
         <w:spacing w:before="0" w:after="60"/>
       </w:pPr>
       <w:r>
@@ -72,7 +96,7 @@
           <w:color w:val="1A1A1A"/>
           <w:sz w:val="20"/>
         </w:rPr>
-        <w:t>The revenue and partnerships teams face three concrete friction points today:</w:t>
+        <w:t>The sales and revenue teams face three concrete friction points today:</w:t>
       </w:r>
     </w:p>
     <w:p>
@@ -88,7 +112,7 @@
           <w:color w:val="1A1A1A"/>
           <w:sz w:val="20"/>
         </w:rPr>
-        <w:t>Targeting &amp; Lead Qualification:</w:t>
+        <w:t>Leverage Labability for Targeting &amp; Lead Qualification:</w:t>
       </w:r>
       <w:r>
         <w:rPr>
@@ -114,7 +138,7 @@
           <w:color w:val="1A1A1A"/>
           <w:sz w:val="20"/>
         </w:rPr>
-        <w:t>Accelerate Discovery:</w:t>
+        <w:t>Accelerate Discovery with AI-Powered Labability Scoring:</w:t>
       </w:r>
       <w:r>
         <w:rPr>
@@ -140,7 +164,7 @@
           <w:color w:val="1A1A1A"/>
           <w:sz w:val="20"/>
         </w:rPr>
-        <w:t>Facilitate Lab Design &amp; Decrease TTV:</w:t>
+        <w:t>Leverage AI-Generated Intelligence to Design Programs and Lab Templates:</w:t>
       </w:r>
       <w:r>
         <w:rPr>

</xml_diff>

<commit_message>
Tighten layout: pull Section 3 table to page 1, fix footer font
- Reduce h1 before-spacing 180→120, after 60→40
- Reduce bullet after-spacing 60→40
- Reduce body after-spacing 80→60
- Reduce title rule after-spacing 140→80
- Deps table: cell margins 80→50 twips, zero paragraph spacing in cells
- Flow boxes: before/after 20→10; labels: after 60→30
- Footer PAGE/NUMPAGES fields: fix sz 18→16 (9pt→8pt) and Arial→Calibri

Co-Authored-By: Claude Sonnet 4.6 <noreply@anthropic.com>
</commit_message>
<xml_diff>
--- a/docs/Skillable-Intelligence-Executive-Briefing.docx
+++ b/docs/Skillable-Intelligence-Executive-Briefing.docx
@@ -31,7 +31,7 @@
     </w:p>
     <w:p>
       <w:pPr>
-        <w:spacing w:before="0" w:after="140"/>
+        <w:spacing w:before="0" w:after="80"/>
         <w:pBdr>
           <w:bottom w:val="single" w:sz="10" w:space="1" w:color="1A4D35"/>
         </w:pBdr>
@@ -44,7 +44,7 @@
     </w:p>
     <w:p>
       <w:pPr>
-        <w:spacing w:before="180" w:after="60"/>
+        <w:spacing w:before="120" w:after="40"/>
         <w:pBdr>
           <w:bottom w:val="single" w:sz="6" w:space="1" w:color="1A4D35"/>
         </w:pBdr>
@@ -102,7 +102,7 @@
     <w:p>
       <w:pPr>
         <w:pStyle w:val="ListBullet"/>
-        <w:spacing w:before="0" w:after="60"/>
+        <w:spacing w:before="0" w:after="40"/>
       </w:pPr>
       <w:r>
         <w:rPr>
@@ -128,7 +128,7 @@
     <w:p>
       <w:pPr>
         <w:pStyle w:val="ListBullet"/>
-        <w:spacing w:before="0" w:after="60"/>
+        <w:spacing w:before="0" w:after="40"/>
       </w:pPr>
       <w:r>
         <w:rPr>
@@ -154,7 +154,7 @@
     <w:p>
       <w:pPr>
         <w:pStyle w:val="ListBullet"/>
-        <w:spacing w:before="0" w:after="60"/>
+        <w:spacing w:before="0" w:after="40"/>
       </w:pPr>
       <w:r>
         <w:rPr>
@@ -179,7 +179,7 @@
     </w:p>
     <w:p>
       <w:pPr>
-        <w:spacing w:before="40" w:after="100"/>
+        <w:spacing w:before="20" w:after="60"/>
       </w:pPr>
       <w:r>
         <w:rPr>
@@ -194,7 +194,7 @@
     </w:p>
     <w:p>
       <w:pPr>
-        <w:spacing w:before="180" w:after="60"/>
+        <w:spacing w:before="120" w:after="40"/>
         <w:pBdr>
           <w:bottom w:val="single" w:sz="6" w:space="1" w:color="1A4D35"/>
         </w:pBdr>
@@ -228,7 +228,7 @@
     <w:p>
       <w:pPr>
         <w:pStyle w:val="ListBullet"/>
-        <w:spacing w:before="0" w:after="60"/>
+        <w:spacing w:before="0" w:after="40"/>
       </w:pPr>
       <w:r>
         <w:rPr>
@@ -254,7 +254,7 @@
     <w:p>
       <w:pPr>
         <w:pStyle w:val="ListBullet"/>
-        <w:spacing w:before="0" w:after="60"/>
+        <w:spacing w:before="0" w:after="40"/>
       </w:pPr>
       <w:r>
         <w:rPr>
@@ -280,7 +280,7 @@
     <w:p>
       <w:pPr>
         <w:pStyle w:val="ListBullet"/>
-        <w:spacing w:before="0" w:after="60"/>
+        <w:spacing w:before="0" w:after="40"/>
       </w:pPr>
       <w:r>
         <w:rPr>
@@ -305,7 +305,7 @@
     </w:p>
     <w:p>
       <w:pPr>
-        <w:spacing w:before="180" w:after="60"/>
+        <w:spacing w:before="120" w:after="40"/>
         <w:pBdr>
           <w:bottom w:val="single" w:sz="6" w:space="1" w:color="1A4D35"/>
         </w:pBdr>
@@ -362,7 +362,7 @@
           </w:tcPr>
           <w:p>
             <w:pPr>
-              <w:spacing w:before="0" w:after="60"/>
+              <w:spacing w:before="0" w:after="30"/>
             </w:pPr>
             <w:r>
               <w:rPr>
@@ -377,7 +377,7 @@
           <w:p>
             <w:pPr>
               <w:jc w:val="left"/>
-              <w:spacing w:before="20" w:after="20"/>
+              <w:spacing w:before="10" w:after="10"/>
               <w:shd w:val="clear" w:color="auto" w:fill="D0E8DA"/>
               <w:ind w:left="120" w:right="120"/>
             </w:pPr>
@@ -410,7 +410,7 @@
           <w:p>
             <w:pPr>
               <w:jc w:val="left"/>
-              <w:spacing w:before="20" w:after="20"/>
+              <w:spacing w:before="10" w:after="10"/>
               <w:shd w:val="clear" w:color="auto" w:fill="1A4D35"/>
               <w:ind w:left="120" w:right="120"/>
             </w:pPr>
@@ -443,7 +443,7 @@
           <w:p>
             <w:pPr>
               <w:jc w:val="left"/>
-              <w:spacing w:before="20" w:after="20"/>
+              <w:spacing w:before="10" w:after="10"/>
               <w:shd w:val="clear" w:color="auto" w:fill="1A4D35"/>
               <w:ind w:left="120" w:right="120"/>
             </w:pPr>
@@ -476,7 +476,7 @@
           <w:p>
             <w:pPr>
               <w:jc w:val="left"/>
-              <w:spacing w:before="20" w:after="20"/>
+              <w:spacing w:before="10" w:after="10"/>
               <w:shd w:val="clear" w:color="auto" w:fill="1A4D35"/>
               <w:ind w:left="120" w:right="120"/>
             </w:pPr>
@@ -509,7 +509,7 @@
           <w:p>
             <w:pPr>
               <w:jc w:val="left"/>
-              <w:spacing w:before="20" w:after="20"/>
+              <w:spacing w:before="10" w:after="10"/>
               <w:shd w:val="clear" w:color="auto" w:fill="D0E8DA"/>
               <w:ind w:left="120" w:right="120"/>
             </w:pPr>
@@ -536,7 +536,7 @@
           </w:tcPr>
           <w:p>
             <w:pPr>
-              <w:spacing w:before="0" w:after="60"/>
+              <w:spacing w:before="0" w:after="30"/>
             </w:pPr>
             <w:r>
               <w:rPr>
@@ -571,13 +571,16 @@
                     <w:right w:val="single" w:sz="4" w:space="0" w:color="1A4D35"/>
                   </w:tcBorders>
                   <w:tcMar>
-                    <w:top w:w="80" w:type="dxa"/>
-                    <w:left w:w="80" w:type="dxa"/>
-                    <w:bottom w:w="80" w:type="dxa"/>
-                    <w:right w:w="80" w:type="dxa"/>
+                    <w:top w:w="50" w:type="dxa"/>
+                    <w:left w:w="50" w:type="dxa"/>
+                    <w:bottom w:w="50" w:type="dxa"/>
+                    <w:right w:w="50" w:type="dxa"/>
                   </w:tcMar>
                 </w:tcPr>
                 <w:p>
+                  <w:pPr>
+                    <w:spacing w:before="0" w:after="0"/>
+                  </w:pPr>
                   <w:r>
                     <w:rPr>
                       <w:rFonts w:ascii="Calibri" w:hAnsi="Calibri"/>
@@ -600,13 +603,16 @@
                     <w:right w:val="single" w:sz="4" w:space="0" w:color="1A4D35"/>
                   </w:tcBorders>
                   <w:tcMar>
-                    <w:top w:w="80" w:type="dxa"/>
-                    <w:left w:w="80" w:type="dxa"/>
-                    <w:bottom w:w="80" w:type="dxa"/>
-                    <w:right w:w="80" w:type="dxa"/>
+                    <w:top w:w="50" w:type="dxa"/>
+                    <w:left w:w="50" w:type="dxa"/>
+                    <w:bottom w:w="50" w:type="dxa"/>
+                    <w:right w:w="50" w:type="dxa"/>
                   </w:tcMar>
                 </w:tcPr>
                 <w:p>
+                  <w:pPr>
+                    <w:spacing w:before="0" w:after="0"/>
+                  </w:pPr>
                   <w:r>
                     <w:rPr>
                       <w:rFonts w:ascii="Calibri" w:hAnsi="Calibri"/>
@@ -629,13 +635,16 @@
                     <w:right w:val="single" w:sz="4" w:space="0" w:color="1A4D35"/>
                   </w:tcBorders>
                   <w:tcMar>
-                    <w:top w:w="80" w:type="dxa"/>
-                    <w:left w:w="80" w:type="dxa"/>
-                    <w:bottom w:w="80" w:type="dxa"/>
-                    <w:right w:w="80" w:type="dxa"/>
+                    <w:top w:w="50" w:type="dxa"/>
+                    <w:left w:w="50" w:type="dxa"/>
+                    <w:bottom w:w="50" w:type="dxa"/>
+                    <w:right w:w="50" w:type="dxa"/>
                   </w:tcMar>
                 </w:tcPr>
                 <w:p>
+                  <w:pPr>
+                    <w:spacing w:before="0" w:after="0"/>
+                  </w:pPr>
                   <w:r>
                     <w:rPr>
                       <w:rFonts w:ascii="Calibri" w:hAnsi="Calibri"/>
@@ -660,13 +669,16 @@
                     <w:right w:val="single" w:sz="4" w:space="0" w:color="CCCCCC"/>
                   </w:tcBorders>
                   <w:tcMar>
-                    <w:top w:w="80" w:type="dxa"/>
-                    <w:left w:w="80" w:type="dxa"/>
-                    <w:bottom w:w="80" w:type="dxa"/>
-                    <w:right w:w="80" w:type="dxa"/>
+                    <w:top w:w="50" w:type="dxa"/>
+                    <w:left w:w="50" w:type="dxa"/>
+                    <w:bottom w:w="50" w:type="dxa"/>
+                    <w:right w:w="50" w:type="dxa"/>
                   </w:tcMar>
                 </w:tcPr>
                 <w:p>
+                  <w:pPr>
+                    <w:spacing w:before="0" w:after="0"/>
+                  </w:pPr>
                   <w:r>
                     <w:rPr>
                       <w:rFonts w:ascii="Calibri" w:hAnsi="Calibri"/>
@@ -689,13 +701,16 @@
                     <w:right w:val="single" w:sz="4" w:space="0" w:color="CCCCCC"/>
                   </w:tcBorders>
                   <w:tcMar>
-                    <w:top w:w="80" w:type="dxa"/>
-                    <w:left w:w="80" w:type="dxa"/>
-                    <w:bottom w:w="80" w:type="dxa"/>
-                    <w:right w:w="80" w:type="dxa"/>
+                    <w:top w:w="50" w:type="dxa"/>
+                    <w:left w:w="50" w:type="dxa"/>
+                    <w:bottom w:w="50" w:type="dxa"/>
+                    <w:right w:w="50" w:type="dxa"/>
                   </w:tcMar>
                 </w:tcPr>
                 <w:p>
+                  <w:pPr>
+                    <w:spacing w:before="0" w:after="0"/>
+                  </w:pPr>
                   <w:r>
                     <w:rPr>
                       <w:rFonts w:ascii="Calibri" w:hAnsi="Calibri"/>
@@ -718,13 +733,16 @@
                     <w:right w:val="single" w:sz="4" w:space="0" w:color="CCCCCC"/>
                   </w:tcBorders>
                   <w:tcMar>
-                    <w:top w:w="80" w:type="dxa"/>
-                    <w:left w:w="80" w:type="dxa"/>
-                    <w:bottom w:w="80" w:type="dxa"/>
-                    <w:right w:w="80" w:type="dxa"/>
+                    <w:top w:w="50" w:type="dxa"/>
+                    <w:left w:w="50" w:type="dxa"/>
+                    <w:bottom w:w="50" w:type="dxa"/>
+                    <w:right w:w="50" w:type="dxa"/>
                   </w:tcMar>
                 </w:tcPr>
                 <w:p>
+                  <w:pPr>
+                    <w:spacing w:before="0" w:after="0"/>
+                  </w:pPr>
                   <w:r>
                     <w:rPr>
                       <w:rFonts w:ascii="Calibri" w:hAnsi="Calibri"/>
@@ -749,13 +767,16 @@
                     <w:right w:val="single" w:sz="4" w:space="0" w:color="CCCCCC"/>
                   </w:tcBorders>
                   <w:tcMar>
-                    <w:top w:w="80" w:type="dxa"/>
-                    <w:left w:w="80" w:type="dxa"/>
-                    <w:bottom w:w="80" w:type="dxa"/>
-                    <w:right w:w="80" w:type="dxa"/>
+                    <w:top w:w="50" w:type="dxa"/>
+                    <w:left w:w="50" w:type="dxa"/>
+                    <w:bottom w:w="50" w:type="dxa"/>
+                    <w:right w:w="50" w:type="dxa"/>
                   </w:tcMar>
                 </w:tcPr>
                 <w:p>
+                  <w:pPr>
+                    <w:spacing w:before="0" w:after="0"/>
+                  </w:pPr>
                   <w:r>
                     <w:rPr>
                       <w:rFonts w:ascii="Calibri" w:hAnsi="Calibri"/>
@@ -778,13 +799,16 @@
                     <w:right w:val="single" w:sz="4" w:space="0" w:color="CCCCCC"/>
                   </w:tcBorders>
                   <w:tcMar>
-                    <w:top w:w="80" w:type="dxa"/>
-                    <w:left w:w="80" w:type="dxa"/>
-                    <w:bottom w:w="80" w:type="dxa"/>
-                    <w:right w:w="80" w:type="dxa"/>
+                    <w:top w:w="50" w:type="dxa"/>
+                    <w:left w:w="50" w:type="dxa"/>
+                    <w:bottom w:w="50" w:type="dxa"/>
+                    <w:right w:w="50" w:type="dxa"/>
                   </w:tcMar>
                 </w:tcPr>
                 <w:p>
+                  <w:pPr>
+                    <w:spacing w:before="0" w:after="0"/>
+                  </w:pPr>
                   <w:r>
                     <w:rPr>
                       <w:rFonts w:ascii="Calibri" w:hAnsi="Calibri"/>
@@ -807,13 +831,16 @@
                     <w:right w:val="single" w:sz="4" w:space="0" w:color="CCCCCC"/>
                   </w:tcBorders>
                   <w:tcMar>
-                    <w:top w:w="80" w:type="dxa"/>
-                    <w:left w:w="80" w:type="dxa"/>
-                    <w:bottom w:w="80" w:type="dxa"/>
-                    <w:right w:w="80" w:type="dxa"/>
+                    <w:top w:w="50" w:type="dxa"/>
+                    <w:left w:w="50" w:type="dxa"/>
+                    <w:bottom w:w="50" w:type="dxa"/>
+                    <w:right w:w="50" w:type="dxa"/>
                   </w:tcMar>
                 </w:tcPr>
                 <w:p>
+                  <w:pPr>
+                    <w:spacing w:before="0" w:after="0"/>
+                  </w:pPr>
                   <w:r>
                     <w:rPr>
                       <w:rFonts w:ascii="Calibri" w:hAnsi="Calibri"/>
@@ -838,13 +865,16 @@
                     <w:right w:val="single" w:sz="4" w:space="0" w:color="CCCCCC"/>
                   </w:tcBorders>
                   <w:tcMar>
-                    <w:top w:w="80" w:type="dxa"/>
-                    <w:left w:w="80" w:type="dxa"/>
-                    <w:bottom w:w="80" w:type="dxa"/>
-                    <w:right w:w="80" w:type="dxa"/>
+                    <w:top w:w="50" w:type="dxa"/>
+                    <w:left w:w="50" w:type="dxa"/>
+                    <w:bottom w:w="50" w:type="dxa"/>
+                    <w:right w:w="50" w:type="dxa"/>
                   </w:tcMar>
                 </w:tcPr>
                 <w:p>
+                  <w:pPr>
+                    <w:spacing w:before="0" w:after="0"/>
+                  </w:pPr>
                   <w:r>
                     <w:rPr>
                       <w:rFonts w:ascii="Calibri" w:hAnsi="Calibri"/>
@@ -867,13 +897,16 @@
                     <w:right w:val="single" w:sz="4" w:space="0" w:color="CCCCCC"/>
                   </w:tcBorders>
                   <w:tcMar>
-                    <w:top w:w="80" w:type="dxa"/>
-                    <w:left w:w="80" w:type="dxa"/>
-                    <w:bottom w:w="80" w:type="dxa"/>
-                    <w:right w:w="80" w:type="dxa"/>
+                    <w:top w:w="50" w:type="dxa"/>
+                    <w:left w:w="50" w:type="dxa"/>
+                    <w:bottom w:w="50" w:type="dxa"/>
+                    <w:right w:w="50" w:type="dxa"/>
                   </w:tcMar>
                 </w:tcPr>
                 <w:p>
+                  <w:pPr>
+                    <w:spacing w:before="0" w:after="0"/>
+                  </w:pPr>
                   <w:r>
                     <w:rPr>
                       <w:rFonts w:ascii="Calibri" w:hAnsi="Calibri"/>
@@ -896,13 +929,16 @@
                     <w:right w:val="single" w:sz="4" w:space="0" w:color="CCCCCC"/>
                   </w:tcBorders>
                   <w:tcMar>
-                    <w:top w:w="80" w:type="dxa"/>
-                    <w:left w:w="80" w:type="dxa"/>
-                    <w:bottom w:w="80" w:type="dxa"/>
-                    <w:right w:w="80" w:type="dxa"/>
+                    <w:top w:w="50" w:type="dxa"/>
+                    <w:left w:w="50" w:type="dxa"/>
+                    <w:bottom w:w="50" w:type="dxa"/>
+                    <w:right w:w="50" w:type="dxa"/>
                   </w:tcMar>
                 </w:tcPr>
                 <w:p>
+                  <w:pPr>
+                    <w:spacing w:before="0" w:after="0"/>
+                  </w:pPr>
                   <w:r>
                     <w:rPr>
                       <w:rFonts w:ascii="Calibri" w:hAnsi="Calibri"/>
@@ -927,13 +963,16 @@
                     <w:right w:val="single" w:sz="4" w:space="0" w:color="CCCCCC"/>
                   </w:tcBorders>
                   <w:tcMar>
-                    <w:top w:w="80" w:type="dxa"/>
-                    <w:left w:w="80" w:type="dxa"/>
-                    <w:bottom w:w="80" w:type="dxa"/>
-                    <w:right w:w="80" w:type="dxa"/>
+                    <w:top w:w="50" w:type="dxa"/>
+                    <w:left w:w="50" w:type="dxa"/>
+                    <w:bottom w:w="50" w:type="dxa"/>
+                    <w:right w:w="50" w:type="dxa"/>
                   </w:tcMar>
                 </w:tcPr>
                 <w:p>
+                  <w:pPr>
+                    <w:spacing w:before="0" w:after="0"/>
+                  </w:pPr>
                   <w:r>
                     <w:rPr>
                       <w:rFonts w:ascii="Calibri" w:hAnsi="Calibri"/>
@@ -956,13 +995,16 @@
                     <w:right w:val="single" w:sz="4" w:space="0" w:color="CCCCCC"/>
                   </w:tcBorders>
                   <w:tcMar>
-                    <w:top w:w="80" w:type="dxa"/>
-                    <w:left w:w="80" w:type="dxa"/>
-                    <w:bottom w:w="80" w:type="dxa"/>
-                    <w:right w:w="80" w:type="dxa"/>
+                    <w:top w:w="50" w:type="dxa"/>
+                    <w:left w:w="50" w:type="dxa"/>
+                    <w:bottom w:w="50" w:type="dxa"/>
+                    <w:right w:w="50" w:type="dxa"/>
                   </w:tcMar>
                 </w:tcPr>
                 <w:p>
+                  <w:pPr>
+                    <w:spacing w:before="0" w:after="0"/>
+                  </w:pPr>
                   <w:r>
                     <w:rPr>
                       <w:rFonts w:ascii="Calibri" w:hAnsi="Calibri"/>
@@ -985,13 +1027,16 @@
                     <w:right w:val="single" w:sz="4" w:space="0" w:color="CCCCCC"/>
                   </w:tcBorders>
                   <w:tcMar>
-                    <w:top w:w="80" w:type="dxa"/>
-                    <w:left w:w="80" w:type="dxa"/>
-                    <w:bottom w:w="80" w:type="dxa"/>
-                    <w:right w:w="80" w:type="dxa"/>
+                    <w:top w:w="50" w:type="dxa"/>
+                    <w:left w:w="50" w:type="dxa"/>
+                    <w:bottom w:w="50" w:type="dxa"/>
+                    <w:right w:w="50" w:type="dxa"/>
                   </w:tcMar>
                 </w:tcPr>
                 <w:p>
+                  <w:pPr>
+                    <w:spacing w:before="0" w:after="0"/>
+                  </w:pPr>
                   <w:r>
                     <w:rPr>
                       <w:rFonts w:ascii="Calibri" w:hAnsi="Calibri"/>
@@ -1021,7 +1066,7 @@
     </w:p>
     <w:p>
       <w:pPr>
-        <w:spacing w:before="180" w:after="60"/>
+        <w:spacing w:before="120" w:after="40"/>
         <w:pBdr>
           <w:bottom w:val="single" w:sz="6" w:space="1" w:color="1A4D35"/>
         </w:pBdr>
@@ -1040,7 +1085,7 @@
     <w:p>
       <w:pPr>
         <w:pStyle w:val="ListBullet"/>
-        <w:spacing w:before="0" w:after="60"/>
+        <w:spacing w:before="0" w:after="40"/>
       </w:pPr>
       <w:r>
         <w:rPr>
@@ -1066,7 +1111,7 @@
     <w:p>
       <w:pPr>
         <w:pStyle w:val="ListBullet"/>
-        <w:spacing w:before="0" w:after="60"/>
+        <w:spacing w:before="0" w:after="40"/>
       </w:pPr>
       <w:r>
         <w:rPr>
@@ -1092,7 +1137,7 @@
     <w:p>
       <w:pPr>
         <w:pStyle w:val="ListBullet"/>
-        <w:spacing w:before="0" w:after="60"/>
+        <w:spacing w:before="0" w:after="40"/>
       </w:pPr>
       <w:r>
         <w:rPr>
@@ -1118,7 +1163,7 @@
     <w:p>
       <w:pPr>
         <w:pStyle w:val="ListBullet"/>
-        <w:spacing w:before="0" w:after="60"/>
+        <w:spacing w:before="0" w:after="40"/>
       </w:pPr>
       <w:r>
         <w:rPr>
@@ -1326,7 +1371,7 @@
     </w:p>
     <w:p>
       <w:pPr>
-        <w:spacing w:before="180" w:after="60"/>
+        <w:spacing w:before="120" w:after="40"/>
         <w:pBdr>
           <w:bottom w:val="single" w:sz="6" w:space="1" w:color="1A4D35"/>
         </w:pBdr>
@@ -1345,7 +1390,7 @@
     <w:p>
       <w:pPr>
         <w:pStyle w:val="ListBullet"/>
-        <w:spacing w:before="0" w:after="60"/>
+        <w:spacing w:before="0" w:after="40"/>
       </w:pPr>
       <w:r>
         <w:rPr>
@@ -1371,7 +1416,7 @@
     <w:p>
       <w:pPr>
         <w:pStyle w:val="ListBullet"/>
-        <w:spacing w:before="0" w:after="60"/>
+        <w:spacing w:before="0" w:after="40"/>
       </w:pPr>
       <w:r>
         <w:rPr>
@@ -1397,7 +1442,7 @@
     <w:p>
       <w:pPr>
         <w:pStyle w:val="ListBullet"/>
-        <w:spacing w:before="0" w:after="60"/>
+        <w:spacing w:before="0" w:after="40"/>
       </w:pPr>
       <w:r>
         <w:rPr>
@@ -1422,7 +1467,7 @@
     </w:p>
     <w:p>
       <w:pPr>
-        <w:spacing w:before="180" w:after="60"/>
+        <w:spacing w:before="120" w:after="40"/>
         <w:pBdr>
           <w:bottom w:val="single" w:sz="6" w:space="1" w:color="1A4D35"/>
         </w:pBdr>
@@ -1797,21 +1842,39 @@
     </w:r>
     <w:r>
       <w:rPr>
+        <w:rFonts w:ascii="Calibri" w:hAnsi="Calibri"/>
+        <w:sz w:val="16"/>
+        <w:szCs w:val="16"/>
+        <w:color w:val="888888"/>
+      </w:rPr>
+      <w:instrText xml:space="preserve"> PAGE </w:instrText>
+    </w:r>
+    <w:r>
+      <w:rPr>
+        <w:rFonts w:ascii="Calibri" w:hAnsi="Calibri"/>
+        <w:sz w:val="16"/>
+        <w:szCs w:val="16"/>
+        <w:color w:val="888888"/>
+      </w:rPr>
+      <w:fldChar w:fldCharType="end"/>
+    </w:r>
+    <w:r>
+      <w:rPr>
+        <w:rFonts w:ascii="Calibri" w:hAnsi="Calibri"/>
+        <w:sz w:val="16"/>
+        <w:szCs w:val="16"/>
+        <w:color w:val="888888"/>
+      </w:rPr>
+      <w:t xml:space="preserve"> of </w:t>
+    </w:r>
+    <w:r>
+      <w:rPr>
         <w:rFonts w:ascii="Arial" w:hAnsi="Arial"/>
         <w:sz w:val="18"/>
         <w:szCs w:val="18"/>
         <w:color w:val="888888"/>
       </w:rPr>
-      <w:instrText xml:space="preserve"> PAGE </w:instrText>
-    </w:r>
-    <w:r>
-      <w:rPr>
-        <w:rFonts w:ascii="Arial" w:hAnsi="Arial"/>
-        <w:sz w:val="18"/>
-        <w:szCs w:val="18"/>
-        <w:color w:val="888888"/>
-      </w:rPr>
-      <w:fldChar w:fldCharType="end"/>
+      <w:fldChar w:fldCharType="begin"/>
     </w:r>
     <w:r>
       <w:rPr>
@@ -1820,31 +1883,13 @@
         <w:szCs w:val="16"/>
         <w:color w:val="888888"/>
       </w:rPr>
-      <w:t xml:space="preserve"> of </w:t>
-    </w:r>
-    <w:r>
-      <w:rPr>
-        <w:rFonts w:ascii="Arial" w:hAnsi="Arial"/>
-        <w:sz w:val="18"/>
-        <w:szCs w:val="18"/>
-        <w:color w:val="888888"/>
-      </w:rPr>
-      <w:fldChar w:fldCharType="begin"/>
-    </w:r>
-    <w:r>
-      <w:rPr>
-        <w:rFonts w:ascii="Arial" w:hAnsi="Arial"/>
-        <w:sz w:val="18"/>
-        <w:szCs w:val="18"/>
-        <w:color w:val="888888"/>
-      </w:rPr>
       <w:instrText xml:space="preserve"> NUMPAGES </w:instrText>
     </w:r>
     <w:r>
       <w:rPr>
-        <w:rFonts w:ascii="Arial" w:hAnsi="Arial"/>
-        <w:sz w:val="18"/>
-        <w:szCs w:val="18"/>
+        <w:rFonts w:ascii="Calibri" w:hAnsi="Calibri"/>
+        <w:sz w:val="16"/>
+        <w:szCs w:val="16"/>
         <w:color w:val="888888"/>
       </w:rPr>
       <w:fldChar w:fldCharType="end"/>

</xml_diff>

<commit_message>
Doc: thin tree border, page break before S6, rename S6, column gutter, centered headings, fix footer r1 font
- Repo tree wrapped in bordered single-cell table (gray border, F2F5F3 bg, 120 twip padding)
- Page break inserted before Section 6
- Section 6 renamed to 'Questions & Recommendations'
- Open questions table restructured to 3-col (left | 480-twip spacer | right) for wider column gutter
- SecOps / RevOps headings centered
- Footer fldChar begin run (r1) corrected to sz=16 Calibri (was sz=18 Arial)

Co-Authored-By: Claude Sonnet 4.6 <noreply@anthropic.com>
</commit_message>
<xml_diff>
--- a/docs/Skillable-Intelligence-Executive-Briefing.docx
+++ b/docs/Skillable-Intelligence-Executive-Briefing.docx
@@ -1209,156 +1209,169 @@
         <w:t>Current repo structure (github.com/fgartland4/skillable-intelligence):</w:t>
       </w:r>
     </w:p>
-    <w:p>
-      <w:pPr>
-        <w:spacing w:before="0" w:after="0"/>
-        <w:shd w:val="clear" w:color="auto" w:fill="F2F5F3"/>
-        <w:ind w:left="200" w:right="200"/>
-      </w:pPr>
-      <w:r>
-        <w:rPr>
-          <w:rFonts w:ascii="Consolas" w:hAnsi="Consolas"/>
-          <w:color w:val="1A1A1A"/>
-          <w:sz w:val="16"/>
-        </w:rPr>
-        <w:t>skillable-intelligence/          ← Personal GitHub (fgartland4) — needs to move to Skillable org</w:t>
-      </w:r>
-    </w:p>
-    <w:p>
-      <w:pPr>
-        <w:spacing w:before="0" w:after="0"/>
-        <w:shd w:val="clear" w:color="auto" w:fill="F2F5F3"/>
-        <w:ind w:left="200" w:right="200"/>
-      </w:pPr>
-      <w:r>
-        <w:rPr>
-          <w:rFonts w:ascii="Consolas" w:hAnsi="Consolas"/>
-          <w:color w:val="1A1A1A"/>
-          <w:sz w:val="16"/>
-        </w:rPr>
-        <w:t>├── backend/                     Flask app: routes, scoring engine, AI calls, storage</w:t>
-      </w:r>
-    </w:p>
-    <w:p>
-      <w:pPr>
-        <w:spacing w:before="0" w:after="0"/>
-        <w:shd w:val="clear" w:color="auto" w:fill="F2F5F3"/>
-        <w:ind w:left="200" w:right="200"/>
-      </w:pPr>
-      <w:r>
-        <w:rPr>
-          <w:rFonts w:ascii="Consolas" w:hAnsi="Consolas"/>
-          <w:color w:val="1A1A1A"/>
-          <w:sz w:val="16"/>
-        </w:rPr>
-        <w:t>├── tools/</w:t>
-      </w:r>
-    </w:p>
-    <w:p>
-      <w:pPr>
-        <w:spacing w:before="0" w:after="0"/>
-        <w:shd w:val="clear" w:color="auto" w:fill="F2F5F3"/>
-        <w:ind w:left="200" w:right="200"/>
-      </w:pPr>
-      <w:r>
-        <w:rPr>
-          <w:rFonts w:ascii="Consolas" w:hAnsi="Consolas"/>
-          <w:color w:val="1A1A1A"/>
-          <w:sz w:val="16"/>
-        </w:rPr>
-        <w:t>│   ├── inspector/templates/     Inspector UI</w:t>
-      </w:r>
-    </w:p>
-    <w:p>
-      <w:pPr>
-        <w:spacing w:before="0" w:after="0"/>
-        <w:shd w:val="clear" w:color="auto" w:fill="F2F5F3"/>
-        <w:ind w:left="200" w:right="200"/>
-      </w:pPr>
-      <w:r>
-        <w:rPr>
-          <w:rFonts w:ascii="Consolas" w:hAnsi="Consolas"/>
-          <w:color w:val="1A1A1A"/>
-          <w:sz w:val="16"/>
-        </w:rPr>
-        <w:t>│   ├── prospector/templates/    Prospector UI</w:t>
-      </w:r>
-    </w:p>
-    <w:p>
-      <w:pPr>
-        <w:spacing w:before="0" w:after="0"/>
-        <w:shd w:val="clear" w:color="auto" w:fill="F2F5F3"/>
-        <w:ind w:left="200" w:right="200"/>
-      </w:pPr>
-      <w:r>
-        <w:rPr>
-          <w:rFonts w:ascii="Consolas" w:hAnsi="Consolas"/>
-          <w:color w:val="1A1A1A"/>
-          <w:sz w:val="16"/>
-        </w:rPr>
-        <w:t>│   └── designer/                Designer UI + client JS</w:t>
-      </w:r>
-    </w:p>
-    <w:p>
-      <w:pPr>
-        <w:spacing w:before="0" w:after="0"/>
-        <w:shd w:val="clear" w:color="auto" w:fill="F2F5F3"/>
-        <w:ind w:left="200" w:right="200"/>
-      </w:pPr>
-      <w:r>
-        <w:rPr>
-          <w:rFonts w:ascii="Consolas" w:hAnsi="Consolas"/>
-          <w:color w:val="1A1A1A"/>
-          <w:sz w:val="16"/>
-        </w:rPr>
-        <w:t>├── static/                      Shared CSS, JS, images</w:t>
-      </w:r>
-    </w:p>
-    <w:p>
-      <w:pPr>
-        <w:spacing w:before="0" w:after="0"/>
-        <w:shd w:val="clear" w:color="auto" w:fill="F2F5F3"/>
-        <w:ind w:left="200" w:right="200"/>
-      </w:pPr>
-      <w:r>
-        <w:rPr>
-          <w:rFonts w:ascii="Consolas" w:hAnsi="Consolas"/>
-          <w:color w:val="1A1A1A"/>
-          <w:sz w:val="16"/>
-        </w:rPr>
-        <w:t>├── docs/                        Executive briefing + generator</w:t>
-      </w:r>
-    </w:p>
-    <w:p>
-      <w:pPr>
-        <w:spacing w:before="0" w:after="0"/>
-        <w:shd w:val="clear" w:color="auto" w:fill="F2F5F3"/>
-        <w:ind w:left="200" w:right="200"/>
-      </w:pPr>
-      <w:r>
-        <w:rPr>
-          <w:rFonts w:ascii="Consolas" w:hAnsi="Consolas"/>
-          <w:color w:val="1A1A1A"/>
-          <w:sz w:val="16"/>
-        </w:rPr>
-        <w:t>├── .gitignore</w:t>
-      </w:r>
-    </w:p>
-    <w:p>
-      <w:pPr>
-        <w:spacing w:before="0" w:after="0"/>
-        <w:shd w:val="clear" w:color="auto" w:fill="F2F5F3"/>
-        <w:ind w:left="200" w:right="200"/>
-      </w:pPr>
-      <w:r>
-        <w:rPr>
-          <w:rFonts w:ascii="Consolas" w:hAnsi="Consolas"/>
-          <w:color w:val="1A1A1A"/>
-          <w:sz w:val="16"/>
-        </w:rPr>
-        <w:t>└── render.yaml                  Deployment config</w:t>
-      </w:r>
-    </w:p>
+    <w:tbl>
+      <w:tblPr>
+        <w:tblW w:type="auto" w:w="0"/>
+        <w:jc w:val="left"/>
+        <w:tblLook w:firstColumn="1" w:firstRow="1" w:lastColumn="0" w:lastRow="0" w:noHBand="0" w:noVBand="1" w:val="04A0"/>
+        <w:tblW w:w="9792" w:type="dxa"/>
+        <w:tblBorders>
+          <w:top w:val="single" w:sz="4" w:space="0" w:color="AAAAAA"/>
+          <w:left w:val="single" w:sz="4" w:space="0" w:color="AAAAAA"/>
+          <w:bottom w:val="single" w:sz="4" w:space="0" w:color="AAAAAA"/>
+          <w:right w:val="single" w:sz="4" w:space="0" w:color="AAAAAA"/>
+          <w:insideH w:val="none" w:sz="0" w:space="0" w:color="auto"/>
+          <w:insideV w:val="none" w:sz="0" w:space="0" w:color="auto"/>
+        </w:tblBorders>
+      </w:tblPr>
+      <w:tblGrid>
+        <w:gridCol w:w="9792"/>
+      </w:tblGrid>
+      <w:tr>
+        <w:tc>
+          <w:tcPr>
+            <w:tcW w:type="dxa" w:w="9792"/>
+            <w:shd w:val="clear" w:color="auto" w:fill="F2F5F3"/>
+            <w:tcMar>
+              <w:top w:w="120" w:type="dxa"/>
+              <w:left w:w="120" w:type="dxa"/>
+              <w:bottom w:w="120" w:type="dxa"/>
+              <w:right w:w="120" w:type="dxa"/>
+            </w:tcMar>
+          </w:tcPr>
+          <w:p>
+            <w:pPr>
+              <w:spacing w:before="0" w:after="0"/>
+            </w:pPr>
+            <w:r>
+              <w:rPr>
+                <w:rFonts w:ascii="Consolas" w:hAnsi="Consolas"/>
+                <w:color w:val="1A1A1A"/>
+                <w:sz w:val="16"/>
+              </w:rPr>
+              <w:t>skillable-intelligence/          ← Personal GitHub (fgartland4) — needs to move to Skillable org</w:t>
+            </w:r>
+          </w:p>
+          <w:p>
+            <w:pPr>
+              <w:spacing w:before="0" w:after="0"/>
+            </w:pPr>
+            <w:r>
+              <w:rPr>
+                <w:rFonts w:ascii="Consolas" w:hAnsi="Consolas"/>
+                <w:color w:val="1A1A1A"/>
+                <w:sz w:val="16"/>
+              </w:rPr>
+              <w:t>├── backend/                     Flask app: routes, scoring engine, AI calls, storage</w:t>
+            </w:r>
+          </w:p>
+          <w:p>
+            <w:pPr>
+              <w:spacing w:before="0" w:after="0"/>
+            </w:pPr>
+            <w:r>
+              <w:rPr>
+                <w:rFonts w:ascii="Consolas" w:hAnsi="Consolas"/>
+                <w:color w:val="1A1A1A"/>
+                <w:sz w:val="16"/>
+              </w:rPr>
+              <w:t>├── tools/</w:t>
+            </w:r>
+          </w:p>
+          <w:p>
+            <w:pPr>
+              <w:spacing w:before="0" w:after="0"/>
+            </w:pPr>
+            <w:r>
+              <w:rPr>
+                <w:rFonts w:ascii="Consolas" w:hAnsi="Consolas"/>
+                <w:color w:val="1A1A1A"/>
+                <w:sz w:val="16"/>
+              </w:rPr>
+              <w:t>│   ├── inspector/templates/     Inspector UI</w:t>
+            </w:r>
+          </w:p>
+          <w:p>
+            <w:pPr>
+              <w:spacing w:before="0" w:after="0"/>
+            </w:pPr>
+            <w:r>
+              <w:rPr>
+                <w:rFonts w:ascii="Consolas" w:hAnsi="Consolas"/>
+                <w:color w:val="1A1A1A"/>
+                <w:sz w:val="16"/>
+              </w:rPr>
+              <w:t>│   ├── prospector/templates/    Prospector UI</w:t>
+            </w:r>
+          </w:p>
+          <w:p>
+            <w:pPr>
+              <w:spacing w:before="0" w:after="0"/>
+            </w:pPr>
+            <w:r>
+              <w:rPr>
+                <w:rFonts w:ascii="Consolas" w:hAnsi="Consolas"/>
+                <w:color w:val="1A1A1A"/>
+                <w:sz w:val="16"/>
+              </w:rPr>
+              <w:t>│   └── designer/                Designer UI + client JS</w:t>
+            </w:r>
+          </w:p>
+          <w:p>
+            <w:pPr>
+              <w:spacing w:before="0" w:after="0"/>
+            </w:pPr>
+            <w:r>
+              <w:rPr>
+                <w:rFonts w:ascii="Consolas" w:hAnsi="Consolas"/>
+                <w:color w:val="1A1A1A"/>
+                <w:sz w:val="16"/>
+              </w:rPr>
+              <w:t>├── static/                      Shared CSS, JS, images</w:t>
+            </w:r>
+          </w:p>
+          <w:p>
+            <w:pPr>
+              <w:spacing w:before="0" w:after="0"/>
+            </w:pPr>
+            <w:r>
+              <w:rPr>
+                <w:rFonts w:ascii="Consolas" w:hAnsi="Consolas"/>
+                <w:color w:val="1A1A1A"/>
+                <w:sz w:val="16"/>
+              </w:rPr>
+              <w:t>├── docs/                        Executive briefing + generator</w:t>
+            </w:r>
+          </w:p>
+          <w:p>
+            <w:pPr>
+              <w:spacing w:before="0" w:after="0"/>
+            </w:pPr>
+            <w:r>
+              <w:rPr>
+                <w:rFonts w:ascii="Consolas" w:hAnsi="Consolas"/>
+                <w:color w:val="1A1A1A"/>
+                <w:sz w:val="16"/>
+              </w:rPr>
+              <w:t>├── .gitignore</w:t>
+            </w:r>
+          </w:p>
+          <w:p>
+            <w:pPr>
+              <w:spacing w:before="0" w:after="0"/>
+            </w:pPr>
+            <w:r>
+              <w:rPr>
+                <w:rFonts w:ascii="Consolas" w:hAnsi="Consolas"/>
+                <w:color w:val="1A1A1A"/>
+                <w:sz w:val="16"/>
+              </w:rPr>
+              <w:t>└── render.yaml                  Deployment config</w:t>
+            </w:r>
+          </w:p>
+        </w:tc>
+      </w:tr>
+    </w:tbl>
     <w:p>
       <w:pPr>
         <w:spacing w:before="0" w:after="0"/>
@@ -1467,6 +1480,14 @@
     </w:p>
     <w:p>
       <w:pPr>
+        <w:spacing w:before="0" w:after="0"/>
+      </w:pPr>
+      <w:r>
+        <w:br w:type="page"/>
+      </w:r>
+    </w:p>
+    <w:p>
+      <w:pPr>
         <w:spacing w:before="120" w:after="40"/>
         <w:pBdr>
           <w:bottom w:val="single" w:sz="6" w:space="1" w:color="1A4D35"/>
@@ -1480,7 +1501,7 @@
           <w:color w:val="1A4D35"/>
           <w:sz w:val="24"/>
         </w:rPr>
-        <w:t>6.  Open Questions</w:t>
+        <w:t>6.  Questions &amp; Recommendations</w:t>
       </w:r>
     </w:p>
     <w:p>
@@ -1508,13 +1529,14 @@
         </w:tblBorders>
       </w:tblPr>
       <w:tblGrid>
-        <w:gridCol w:w="4896"/>
-        <w:gridCol w:w="4896"/>
+        <w:gridCol w:w="3264"/>
+        <w:gridCol w:w="3264"/>
+        <w:gridCol w:w="3264"/>
       </w:tblGrid>
       <w:tr>
         <w:tc>
           <w:tcPr>
-            <w:tcW w:type="dxa" w:w="4500"/>
+            <w:tcW w:type="dxa" w:w="4400"/>
             <w:tcBorders>
               <w:top w:val="none" w:sz="0" w:space="0" w:color="auto"/>
               <w:left w:val="none" w:sz="0" w:space="0" w:color="auto"/>
@@ -1530,6 +1552,7 @@
           </w:tcPr>
           <w:p>
             <w:pPr>
+              <w:jc w:val="center"/>
               <w:spacing w:before="0" w:after="60"/>
             </w:pPr>
             <w:r>
@@ -1629,7 +1652,25 @@
         </w:tc>
         <w:tc>
           <w:tcPr>
-            <w:tcW w:type="dxa" w:w="4860"/>
+            <w:tcW w:type="dxa" w:w="480"/>
+            <w:tcBorders>
+              <w:top w:val="none" w:sz="0" w:space="0" w:color="auto"/>
+              <w:left w:val="none" w:sz="0" w:space="0" w:color="auto"/>
+              <w:bottom w:val="none" w:sz="0" w:space="0" w:color="auto"/>
+              <w:right w:val="none" w:sz="0" w:space="0" w:color="auto"/>
+            </w:tcBorders>
+            <w:tcMar>
+              <w:top w:w="0" w:type="dxa"/>
+              <w:left w:w="0" w:type="dxa"/>
+              <w:bottom w:w="0" w:type="dxa"/>
+              <w:right w:w="0" w:type="dxa"/>
+            </w:tcMar>
+          </w:tcPr>
+          <w:p/>
+        </w:tc>
+        <w:tc>
+          <w:tcPr>
+            <w:tcW w:type="dxa" w:w="4912"/>
             <w:tcBorders>
               <w:top w:val="none" w:sz="0" w:space="0" w:color="auto"/>
               <w:left w:val="none" w:sz="0" w:space="0" w:color="auto"/>
@@ -1645,6 +1686,7 @@
           </w:tcPr>
           <w:p>
             <w:pPr>
+              <w:jc w:val="center"/>
               <w:spacing w:before="0" w:after="60"/>
             </w:pPr>
             <w:r>
@@ -1833,21 +1875,12 @@
     </w:r>
     <w:r>
       <w:rPr>
-        <w:rFonts w:ascii="Arial" w:hAnsi="Arial"/>
-        <w:sz w:val="18"/>
-        <w:szCs w:val="18"/>
-        <w:color w:val="888888"/>
-      </w:rPr>
-      <w:fldChar w:fldCharType="begin"/>
-    </w:r>
-    <w:r>
-      <w:rPr>
         <w:rFonts w:ascii="Calibri" w:hAnsi="Calibri"/>
         <w:sz w:val="16"/>
         <w:szCs w:val="16"/>
         <w:color w:val="888888"/>
       </w:rPr>
-      <w:instrText xml:space="preserve"> PAGE </w:instrText>
+      <w:fldChar w:fldCharType="begin"/>
     </w:r>
     <w:r>
       <w:rPr>
@@ -1856,7 +1889,7 @@
         <w:szCs w:val="16"/>
         <w:color w:val="888888"/>
       </w:rPr>
-      <w:fldChar w:fldCharType="end"/>
+      <w:instrText xml:space="preserve"> PAGE </w:instrText>
     </w:r>
     <w:r>
       <w:rPr>
@@ -1865,13 +1898,22 @@
         <w:szCs w:val="16"/>
         <w:color w:val="888888"/>
       </w:rPr>
+      <w:fldChar w:fldCharType="end"/>
+    </w:r>
+    <w:r>
+      <w:rPr>
+        <w:rFonts w:ascii="Calibri" w:hAnsi="Calibri"/>
+        <w:sz w:val="16"/>
+        <w:szCs w:val="16"/>
+        <w:color w:val="888888"/>
+      </w:rPr>
       <w:t xml:space="preserve"> of </w:t>
     </w:r>
     <w:r>
       <w:rPr>
-        <w:rFonts w:ascii="Arial" w:hAnsi="Arial"/>
-        <w:sz w:val="18"/>
-        <w:szCs w:val="18"/>
+        <w:rFonts w:ascii="Calibri" w:hAnsi="Calibri"/>
+        <w:sz w:val="16"/>
+        <w:szCs w:val="16"/>
         <w:color w:val="888888"/>
       </w:rPr>
       <w:fldChar w:fldCharType="begin"/>

</xml_diff>

<commit_message>
Update platform docs and add instructional design guide
Co-Authored-By: Claude Sonnet 4.6 <noreply@anthropic.com>
</commit_message>
<xml_diff>
--- a/docs/Skillable-Intelligence-Executive-Briefing.docx
+++ b/docs/Skillable-Intelligence-Executive-Briefing.docx
@@ -1055,7 +1055,6 @@
           <w:color w:val="1A4D35"/>
           <w:sz w:val="24"/>
         </w:rPr>
-        <w:lastRenderedPageBreak/>
         <w:t>4.  Security — What SecOps Needs to Know</w:t>
       </w:r>
     </w:p>
@@ -1445,7 +1444,6 @@
           <w:color w:val="1A4D35"/>
           <w:sz w:val="24"/>
         </w:rPr>
-        <w:lastRenderedPageBreak/>
         <w:t>6.  Questions &amp; Recommendations</w:t>
       </w:r>
     </w:p>
@@ -1738,10 +1736,10 @@
     </w:tbl>
     <w:p/>
     <w:sectPr>
-      <w:headerReference w:type="default" r:id="rId12"/>
-      <w:footerReference w:type="even" r:id="rId13"/>
-      <w:footerReference w:type="default" r:id="rId14"/>
-      <w:footerReference w:type="first" r:id="rId15"/>
+      <w:headerReference w:type="default" r:id="rId11"/>
+      <w:footerReference w:type="even" r:id="rId12"/>
+      <w:footerReference w:type="default" r:id="rId13"/>
+      <w:footerReference w:type="first" r:id="rId14"/>
       <w:pgSz w:w="12240" w:h="15840"/>
       <w:pgMar w:top="1296" w:right="1224" w:bottom="1296" w:left="1224" w:header="504" w:footer="504" w:gutter="0"/>
       <w:cols w:space="720"/>
@@ -2060,6 +2058,9 @@
               <wp:wrapNone/>
               <wp:docPr id="288050050" name="Text Box 2" descr="Skillable INTERNAL">
                 <a:extLst xmlns:a="http://schemas.openxmlformats.org/drawingml/2006/main">
+                  <a:ext uri="{FF2B5EF4-FFF2-40B4-BE49-F238E27FC236}">
+                    <a16:creationId xmlns:a16="http://schemas.microsoft.com/office/drawing/2014/main" id="{20B25002-45D2-4C43-A217-60C11279A954}"/>
+                  </a:ext>
                   <a:ext uri="{5AE41FA2-C0FF-4470-9BD4-5FADCA87CBE2}">
                     <aclsh:classification xmlns:aclsh="http://schemas.microsoft.com/office/drawing/2020/classificationShape" classificationOutcomeType="ftr"/>
                   </a:ext>
@@ -2190,6 +2191,9 @@
               <wp:wrapNone/>
               <wp:docPr id="1542162736" name="Text Box 3" descr="Skillable INTERNAL">
                 <a:extLst xmlns:a="http://schemas.openxmlformats.org/drawingml/2006/main">
+                  <a:ext uri="{FF2B5EF4-FFF2-40B4-BE49-F238E27FC236}">
+                    <a16:creationId xmlns:a16="http://schemas.microsoft.com/office/drawing/2014/main" id="{D6593ED0-E0FF-455D-882B-BF5F2EEE1474}"/>
+                  </a:ext>
                   <a:ext uri="{5AE41FA2-C0FF-4470-9BD4-5FADCA87CBE2}">
                     <aclsh:classification xmlns:aclsh="http://schemas.microsoft.com/office/drawing/2020/classificationShape" classificationOutcomeType="ftr"/>
                   </a:ext>
@@ -2414,6 +2418,9 @@
               <wp:wrapNone/>
               <wp:docPr id="1781597553" name="Text Box 1" descr="Skillable INTERNAL">
                 <a:extLst xmlns:a="http://schemas.openxmlformats.org/drawingml/2006/main">
+                  <a:ext uri="{FF2B5EF4-FFF2-40B4-BE49-F238E27FC236}">
+                    <a16:creationId xmlns:a16="http://schemas.microsoft.com/office/drawing/2014/main" id="{0AD5889D-76C7-4F32-9457-4EB551F1668F}"/>
+                  </a:ext>
                   <a:ext uri="{5AE41FA2-C0FF-4470-9BD4-5FADCA87CBE2}">
                     <aclsh:classification xmlns:aclsh="http://schemas.microsoft.com/office/drawing/2020/classificationShape" classificationOutcomeType="ftr"/>
                   </a:ext>
@@ -2554,7 +2561,13 @@
         <wp:inline distT="0" distB="0" distL="0" distR="0" wp14:anchorId="163EA055" wp14:editId="07777777">
           <wp:extent cx="1005840" cy="334541"/>
           <wp:effectExtent l="0" t="0" r="0" b="0"/>
-          <wp:docPr id="1" name="Picture 1"/>
+          <wp:docPr id="1" name="Picture 1">
+            <a:extLst xmlns:a="http://schemas.openxmlformats.org/drawingml/2006/main">
+              <a:ext uri="{FF2B5EF4-FFF2-40B4-BE49-F238E27FC236}">
+                <a16:creationId xmlns:a16="http://schemas.microsoft.com/office/drawing/2014/main" id="{1BA77869-284F-4B65-9429-AA5CAFF7335D}"/>
+              </a:ext>
+            </a:extLst>
+          </wp:docPr>
           <wp:cNvGraphicFramePr>
             <a:graphicFrameLocks xmlns:a="http://schemas.openxmlformats.org/drawingml/2006/main" noChangeAspect="1"/>
           </wp:cNvGraphicFramePr>
@@ -2753,7 +2766,7 @@
   <w:abstractNum w:abstractNumId="8" w15:restartNumberingAfterBreak="0">
     <w:nsid w:val="FFFFFF89"/>
     <w:multiLevelType w:val="singleLevel"/>
-    <w:tmpl w:val="40E85542"/>
+    <w:tmpl w:val="05AAA874"/>
     <w:lvl w:ilvl="0">
       <w:start w:val="1"/>
       <w:numFmt w:val="bullet"/>
@@ -2771,32 +2784,32 @@
       </w:rPr>
     </w:lvl>
   </w:abstractNum>
-  <w:num w:numId="1" w16cid:durableId="2009016065">
-    <w:abstractNumId w:val="8"/>
-  </w:num>
-  <w:num w:numId="2" w16cid:durableId="1379008966">
+  <w:num w:numId="1" w16cid:durableId="1379008966">
     <w:abstractNumId w:val="6"/>
   </w:num>
-  <w:num w:numId="3" w16cid:durableId="325596468">
-    <w:abstractNumId w:val="5"/>
+  <w:num w:numId="2" w16cid:durableId="1515922994">
+    <w:abstractNumId w:val="4"/>
   </w:num>
-  <w:num w:numId="4" w16cid:durableId="1515922994">
-    <w:abstractNumId w:val="4"/>
+  <w:num w:numId="3" w16cid:durableId="1581064020">
+    <w:abstractNumId w:val="2"/>
+  </w:num>
+  <w:num w:numId="4" w16cid:durableId="1660839529">
+    <w:abstractNumId w:val="1"/>
   </w:num>
   <w:num w:numId="5" w16cid:durableId="1909614725">
     <w:abstractNumId w:val="7"/>
   </w:num>
-  <w:num w:numId="6" w16cid:durableId="640505467">
+  <w:num w:numId="6" w16cid:durableId="2009016065">
+    <w:abstractNumId w:val="8"/>
+  </w:num>
+  <w:num w:numId="7" w16cid:durableId="325596468">
+    <w:abstractNumId w:val="5"/>
+  </w:num>
+  <w:num w:numId="8" w16cid:durableId="500588357">
+    <w:abstractNumId w:val="0"/>
+  </w:num>
+  <w:num w:numId="9" w16cid:durableId="640505467">
     <w:abstractNumId w:val="3"/>
-  </w:num>
-  <w:num w:numId="7" w16cid:durableId="1581064020">
-    <w:abstractNumId w:val="2"/>
-  </w:num>
-  <w:num w:numId="8" w16cid:durableId="1660839529">
-    <w:abstractNumId w:val="1"/>
-  </w:num>
-  <w:num w:numId="9" w16cid:durableId="500588357">
-    <w:abstractNumId w:val="0"/>
   </w:num>
 </w:numbering>
 </file>
@@ -3732,7 +3745,7 @@
     <w:rsid w:val="00326F90"/>
     <w:pPr>
       <w:numPr>
-        <w:numId w:val="1"/>
+        <w:numId w:val="6"/>
       </w:numPr>
       <w:contextualSpacing/>
     </w:pPr>
@@ -3745,7 +3758,7 @@
     <w:rsid w:val="00326F90"/>
     <w:pPr>
       <w:numPr>
-        <w:numId w:val="2"/>
+        <w:numId w:val="1"/>
       </w:numPr>
       <w:contextualSpacing/>
     </w:pPr>
@@ -3758,7 +3771,7 @@
     <w:rsid w:val="00326F90"/>
     <w:pPr>
       <w:numPr>
-        <w:numId w:val="3"/>
+        <w:numId w:val="7"/>
       </w:numPr>
       <w:contextualSpacing/>
     </w:pPr>
@@ -3784,7 +3797,7 @@
     <w:rsid w:val="0029639D"/>
     <w:pPr>
       <w:numPr>
-        <w:numId w:val="6"/>
+        <w:numId w:val="9"/>
       </w:numPr>
       <w:contextualSpacing/>
     </w:pPr>
@@ -3797,7 +3810,7 @@
     <w:rsid w:val="0029639D"/>
     <w:pPr>
       <w:numPr>
-        <w:numId w:val="7"/>
+        <w:numId w:val="3"/>
       </w:numPr>
       <w:contextualSpacing/>
     </w:pPr>
@@ -14585,16 +14598,4 @@
   </a:objectDefaults>
   <a:extraClrSchemeLst/>
 </a:theme>
-</file>
-
-<file path=customXml/item1.xml><?xml version="1.0" encoding="utf-8"?>
-<b:Sources xmlns:b="http://schemas.openxmlformats.org/officeDocument/2006/bibliography" xmlns="http://schemas.openxmlformats.org/officeDocument/2006/bibliography" SelectedStyle="/APA.XSL" StyleName="APA"/>
-</file>
-
-<file path=customXml/itemProps1.xml><?xml version="1.0" encoding="utf-8"?>
-<ds:datastoreItem xmlns:ds="http://schemas.openxmlformats.org/officeDocument/2006/customXml" ds:itemID="{EF278816-EC6F-A645-907D-7F25AECB1D4A}">
-  <ds:schemaRefs>
-    <ds:schemaRef ds:uri="http://schemas.openxmlformats.org/officeDocument/2006/bibliography"/>
-  </ds:schemaRefs>
-</ds:datastoreItem>
 </file>
</xml_diff>